<commit_message>
Share key decisions across parallel section writers; reviewer checks cross-section consistency
</commit_message>
<xml_diff>
--- a/samples/demo_complex.docx
+++ b/samples/demo_complex.docx
@@ -53,7 +53,7 @@
           </w:tcPr>
           <w:p>
             <w:r>
-              <w:t>Chief Technology Officer (CTO) and senior leadership</w:t>
+              <w:t>Chief Technology Officer and executive leadership</w:t>
             </w:r>
           </w:p>
         </w:tc>
@@ -134,7 +134,7 @@
           </w:tcPr>
           <w:p>
             <w:r>
-              <w:t>b1fdad316c</w:t>
+              <w:t>0c243e489a</w:t>
             </w:r>
           </w:p>
         </w:tc>
@@ -151,7 +151,7 @@
     </w:p>
     <w:p>
       <w:r>
-        <w:t>This CRM Cloud Migration Plan presents a low‑budget, six‑week strategy to relocate the organization’s CRM to a cloud environment with zero‑downtime. It defines the migration scope, outlines a six‑phase lift‑and‑shift approach using open‑source tools, provides a week‑by‑week timeline, estimates personnel and cloud costs, and identifies key risks with mitigation actions. The plan balances the tight budget against the aggressive schedule by leveraging existing staff and provider‑agnostic solutions, while highlighting assumptions that must be validated before execution.</w:t>
+        <w:t>The plan outlines a six‑week, $50,000 migration of the on‑premise CRM to AWS using a blue‑green pattern that guarantees zero downtime. Phase 1 (Weeks 1‑2) focuses on discovery and architecture design, Phase 2 (Weeks 3‑4) builds the cloud environment, replicates the 200 GB database, and validates cutover, and Phase 3 (Weeks 5‑6) executes the live switch and provides 48‑hour hyper‑care. Roles and ownership are defined for each phase, and the budget includes internal labor, a $10 k contingency for external tools, and strict cost controls. The approach balances the tight budget with the zero‑downtime requirement through real‑time replication and extensive testing.</w:t>
       </w:r>
     </w:p>
     <w:p>
@@ -159,7 +159,7 @@
         <w:pStyle w:val="ListBullet"/>
       </w:pPr>
       <w:r>
-        <w:t>Confirm user count, exact CRM platform, total budget, and preferred cloud provider</w:t>
+        <w:t>Phase 1: Discovery &amp; Planning led by Business Analyst, Solution Architect, and Project Manager</w:t>
       </w:r>
     </w:p>
     <w:p>
@@ -167,7 +167,7 @@
         <w:pStyle w:val="ListBullet"/>
       </w:pPr>
       <w:r>
-        <w:t>Finalize licensing model and compliance requirements</w:t>
+        <w:t>Phase 2: Build &amp; Test by Cloud, Data, DevOps, and QA Engineers with automated scripts</w:t>
       </w:r>
     </w:p>
     <w:p>
@@ -175,7 +175,7 @@
         <w:pStyle w:val="ListBullet"/>
       </w:pPr>
       <w:r>
-        <w:t>Secure any additional resources or contingency funding needed for risk mitigation</w:t>
+        <w:t>Phase 3: Blue‑green cutover, 48‑hour hyper‑care, and user communication</w:t>
       </w:r>
     </w:p>
     <w:p>
@@ -183,7 +183,15 @@
         <w:pStyle w:val="ListBullet"/>
       </w:pPr>
       <w:r>
-        <w:t>Proceed to detailed design and kickoff once open questions are answered</w:t>
+        <w:t>Budget capped at $50 k, leveraging open‑source tools and a $10 k contingency</w:t>
+      </w:r>
+    </w:p>
+    <w:p>
+      <w:pPr>
+        <w:pStyle w:val="ListBullet"/>
+      </w:pPr>
+      <w:r>
+        <w:t>Roles ownership clearly assigned to ensure accountability and on‑time delivery</w:t>
       </w:r>
     </w:p>
     <w:p>
@@ -191,7 +199,12 @@
         <w:pStyle w:val="Heading1"/>
       </w:pPr>
       <w:r>
-        <w:t>Scope &amp; Objectives</w:t>
+        <w:t>Scope</w:t>
+      </w:r>
+    </w:p>
+    <w:p>
+      <w:r>
+        <w:t>The migration scope encompasses all components required for the CRM to operate in the target cloud environment while excluding ancillary systems that are not part of the core CRM functionality.</w:t>
       </w:r>
     </w:p>
     <w:p>
@@ -199,7 +212,7 @@
         <w:pStyle w:val="ListBullet"/>
       </w:pPr>
       <w:r>
-        <w:t>In‑Scope: Migration of all CRM data (records, attachments, and metadata) to the selected cloud environment</w:t>
+        <w:t>CRM application code and configuration (Microsoft Dynamics or equivalent)</w:t>
       </w:r>
     </w:p>
     <w:p>
@@ -207,7 +220,7 @@
         <w:pStyle w:val="ListBullet"/>
       </w:pPr>
       <w:r>
-        <w:t>In‑Scope: Transfer of existing user access controls and role‑based permissions using a scalable licensing model (user count to be confirmed)</w:t>
+        <w:t>Primary relational database (SQL‑based, ~200 GB) including schema, stored procedures, and indexes</w:t>
       </w:r>
     </w:p>
     <w:p>
@@ -215,7 +228,7 @@
         <w:pStyle w:val="ListBullet"/>
       </w:pPr>
       <w:r>
-        <w:t>In‑Scope: Replication of current integrations (email, ERP, analytics) via API gateways to maintain functional continuity</w:t>
+        <w:t>User‑generated attachments and document storage linked to CRM records</w:t>
       </w:r>
     </w:p>
     <w:p>
@@ -223,7 +236,12 @@
         <w:pStyle w:val="ListBullet"/>
       </w:pPr>
       <w:r>
-        <w:t>In‑Scope: Implementation of baseline security controls (encryption at rest and in transit, multi‑factor authentication, audit logging) to meet standard industry regulations</w:t>
+        <w:t>Supporting middleware scripts required for real‑time data replication during blue‑green cutover</w:t>
+      </w:r>
+    </w:p>
+    <w:p>
+      <w:r>
+        <w:t>Target cloud platform: Amazon Web Services (AWS) – the architecture will be defined in a provider‑agnostic manner to allow future migration to other clouds if needed.</w:t>
       </w:r>
     </w:p>
     <w:p>
@@ -231,7 +249,20 @@
         <w:pStyle w:val="ListBullet"/>
       </w:pPr>
       <w:r>
-        <w:t>In‑Scope: Zero‑downtime cut‑over strategy employing live data sync and traffic shadowing</w:t>
+        <w:t>Exclusions: Legacy reporting tools that interface with the on‑premise CRM but are not migrated; any non‑CRM enterprise applications (e.g., ERP, HR systems); custom integrations that will be decommissioned or re‑implemented post‑migration; hardware‑specific components such as on‑premise load balancers</w:t>
+      </w:r>
+    </w:p>
+    <w:p>
+      <w:pPr>
+        <w:pStyle w:val="Heading1"/>
+      </w:pPr>
+      <w:r>
+        <w:t>Approach &amp; Methodology</w:t>
+      </w:r>
+    </w:p>
+    <w:p>
+      <w:r>
+        <w:t>The migration will follow a blue‑green pattern that enables a parallel production‑grade environment in AWS while the on‑premise CRM remains live. A real‑time data replication service (e.g., AWS Database Migration Service) will continuously sync the on‑premise SQL database to the cloud replica, ensuring that any transaction occurring during the build phase is captured. The replication topology is configured as one‑way (on‑premise → cloud) with change data capture enabled, and a fallback switch is retained until the final cutover validation is complete.</w:t>
       </w:r>
     </w:p>
     <w:p>
@@ -239,7 +270,7 @@
         <w:pStyle w:val="ListBullet"/>
       </w:pPr>
       <w:r>
-        <w:t>Out‑of‑Scope: Migration or modernization of any non‑CRM systems (e.g., HR, finance applications)</w:t>
+        <w:t>Phase 1 (Weeks 1‑2 – Discovery &amp; Planning): Business Analyst gathers user‑access patterns and data‑retention requirements; Solution Architect designs the target AWS architecture, including VPC, subnets, security groups, and the blue‑green deployment topology; Project Manager finalises the detailed schedule and risk log.</w:t>
       </w:r>
     </w:p>
     <w:p>
@@ -247,7 +278,7 @@
         <w:pStyle w:val="ListBullet"/>
       </w:pPr>
       <w:r>
-        <w:t>Out‑of‑Scope: Post‑migration performance tuning or long‑term cost‑optimization initiatives beyond the initial 6‑week rollout</w:t>
+        <w:t>Phase 2 (Weeks 3‑4 – Build &amp; Test): Cloud Engineer provisions the blue environment (identical instance types, storage, and networking); Data Engineer configures DMS tasks to replicate the 200 GB database and attachment store; DevOps Engineer scripts infrastructure‑as‑code (Terraform) and automated fail‑over procedures; QA Engineer executes functional, performance, and zero‑downtime cutover simulations using a staged data set; any issues are logged and remediated before proceeding.</w:t>
       </w:r>
     </w:p>
     <w:p>
@@ -255,12 +286,12 @@
         <w:pStyle w:val="ListBullet"/>
       </w:pPr>
       <w:r>
-        <w:t>Out‑of‑Scope: Development of new custom integrations or feature enhancements not present in the current CRM</w:t>
+        <w:t>Phase 3 (Weeks 5‑6 – Cutover &amp; Hypercare): A coordinated blue‑green switch is performed during a low‑traffic window; DNS and load‑balancer endpoints are updated to point to the green (cloud) environment; real‑time replication is paused, final data delta is applied, and the on‑premise system is de‑commissioned; Support Engineer monitors the system for 48 hours, handling any post‑cutover incidents; Trainer distributes user communication and quick‑start guides.</w:t>
       </w:r>
     </w:p>
     <w:p>
       <w:r>
-        <w:t>The scope reflects the key facts—tight budget, 6‑week deadline, and zero‑downtime requirement—and aligns with assumptions that user count is pending, the cloud provider is provider‑agnostic, and existing staff will drive the effort using cost‑effective, open‑source tooling.</w:t>
+        <w:t>Testing strategy emphasizes zero‑downtime validation: parallel run tests compare response times and data integrity between blue and green instances; automated regression suites are executed against both environments; a rollback drill is performed in Phase 2 to confirm that traffic can be reverted to the blue environment within five minutes, satisfying the acceptance criterion of &lt; 5 min downtime.</w:t>
       </w:r>
     </w:p>
     <w:p>
@@ -268,105 +299,12 @@
         <w:pStyle w:val="Heading1"/>
       </w:pPr>
       <w:r>
-        <w:t>Migration Approach</w:t>
+        <w:t>Timeline</w:t>
       </w:r>
     </w:p>
     <w:p>
       <w:r>
-        <w:t>The migration will follow a six‑phase lift‑and‑shift model that leverages data replication and DNS failover to achieve zero downtime while staying within a tight budget. All activities are designed to be executed by the existing cloud‑savvy engineer and the project manager, supplemented with open‑source tooling to avoid licensing costs.</w:t>
-      </w:r>
-    </w:p>
-    <w:p>
-      <w:pPr>
-        <w:pStyle w:val="ListNumber"/>
-      </w:pPr>
-      <w:r>
-        <w:t>Discovery – Inventory all CRM components, data volumes, and integration endpoints. Use open‑source scanner (e.g., nmap) and create a baseline performance profile. Estimated effort: 2 days.</w:t>
-      </w:r>
-    </w:p>
-    <w:p>
-      <w:pPr>
-        <w:pStyle w:val="ListNumber"/>
-      </w:pPr>
-      <w:r>
-        <w:t>Environment Set‑up – Provision a sandbox environment in the chosen IaaS using infrastructure‑as‑code (Terraform) and configure open‑source replication tools (e.g., pgBackRest for PostgreSQL or SymmetricDS for generic DB). Deploy API gateway (Kong) for integration routing. Estimated effort: 4 days.</w:t>
-      </w:r>
-    </w:p>
-    <w:p>
-      <w:pPr>
-        <w:pStyle w:val="ListNumber"/>
-      </w:pPr>
-      <w:r>
-        <w:t>Pilot – Migrate a low‑risk user segment (≈5 % of total users, estimate) to validate replication latency and integration flow. Conduct functional tests and capture performance metrics. Estimated effort: 5 days.</w:t>
-      </w:r>
-    </w:p>
-    <w:p>
-      <w:pPr>
-        <w:pStyle w:val="ListNumber"/>
-      </w:pPr>
-      <w:r>
-        <w:t>Full Sync – Enable continuous data replication for the entire dataset while the production system remains live. Monitor lag and resolve any schema mismatches. Estimated effort: 7 days.</w:t>
-      </w:r>
-    </w:p>
-    <w:p>
-      <w:pPr>
-        <w:pStyle w:val="ListNumber"/>
-      </w:pPr>
-      <w:r>
-        <w:t>Cut‑over Rehearsal – Perform a DNS failover drill in a controlled window, redirect a test sub‑domain to the cloud instance, and verify end‑to‑end transaction processing. Document rollback steps. Estimated effort: 3 days.</w:t>
-      </w:r>
-    </w:p>
-    <w:p>
-      <w:pPr>
-        <w:pStyle w:val="ListNumber"/>
-      </w:pPr>
-      <w:r>
-        <w:t>Cut‑over &amp; Validation – Execute the final DNS switch during a low‑traffic period, monitor real‑time replication lag (target &lt;5 seconds), and run post‑migration validation scripts. Obtain sign‑off from business owners. Estimated effort: 2 days.</w:t>
-      </w:r>
-    </w:p>
-    <w:p>
-      <w:pPr>
-        <w:pStyle w:val="ListBullet"/>
-      </w:pPr>
-      <w:r>
-        <w:t>Leverage existing staff: Cloud Engineer (lead technical execution) and Project Manager (schedule, risk tracking).</w:t>
-      </w:r>
-    </w:p>
-    <w:p>
-      <w:pPr>
-        <w:pStyle w:val="ListBullet"/>
-      </w:pPr>
-      <w:r>
-        <w:t>Open‑source tools only: Terraform, pgBackRest/SymmetricDS, Kong, Ansible for configuration management.</w:t>
-      </w:r>
-    </w:p>
-    <w:p>
-      <w:pPr>
-        <w:pStyle w:val="ListBullet"/>
-      </w:pPr>
-      <w:r>
-        <w:t>Zero‑downtime guarantee achieved through continuous replication and DNS TTL reduction (TTL set to 60 seconds during cut‑over).</w:t>
-      </w:r>
-    </w:p>
-    <w:p>
-      <w:pPr>
-        <w:pStyle w:val="ListBullet"/>
-      </w:pPr>
-      <w:r>
-        <w:t>Rollback plan: revert DNS to on‑prem endpoint and pause replication if validation fails.</w:t>
-      </w:r>
-    </w:p>
-    <w:p>
-      <w:pPr>
-        <w:pStyle w:val="Heading1"/>
-      </w:pPr>
-      <w:r>
-        <w:t>Project Timeline</w:t>
-      </w:r>
-    </w:p>
-    <w:p>
-      <w:r>
-        <w:t>The following week‑by‑week Gantt‑style table outlines the key migration tasks, responsible roles, and effort estimates (all figures are estimates).</w:t>
+        <w:t>The following table provides an estimated week‑by‑week schedule for the CRM cloud migration, aligning each activity with the defined phases and responsible roles.</w:t>
       </w:r>
     </w:p>
     <w:tbl>
@@ -411,7 +349,23 @@
                 <w:b/>
                 <w:color w:val="FFFFFF"/>
               </w:rPr>
-              <w:t>Tasks</w:t>
+              <w:t>Phase</w:t>
+            </w:r>
+          </w:p>
+        </w:tc>
+        <w:tc>
+          <w:tcPr>
+            <w:tcW w:type="dxa" w:w="2160"/>
+            <w:shd w:val="clear" w:color="auto" w:fill="1F3A5F"/>
+          </w:tcPr>
+          <w:p>
+            <w:r/>
+            <w:r>
+              <w:rPr>
+                <w:b/>
+                <w:color w:val="FFFFFF"/>
+              </w:rPr>
+              <w:t>Activities</w:t>
             </w:r>
           </w:p>
         </w:tc>
@@ -431,22 +385,6 @@
             </w:r>
           </w:p>
         </w:tc>
-        <w:tc>
-          <w:tcPr>
-            <w:tcW w:type="dxa" w:w="2160"/>
-            <w:shd w:val="clear" w:color="auto" w:fill="1F3A5F"/>
-          </w:tcPr>
-          <w:p>
-            <w:r/>
-            <w:r>
-              <w:rPr>
-                <w:b/>
-                <w:color w:val="FFFFFF"/>
-              </w:rPr>
-              <w:t>Estimated Effort</w:t>
-            </w:r>
-          </w:p>
-        </w:tc>
       </w:tr>
       <w:tr>
         <w:tc>
@@ -456,7 +394,7 @@
           <w:p>
             <w:r/>
             <w:r>
-              <w:t>Week 1</w:t>
+              <w:t>Week 1-2</w:t>
             </w:r>
           </w:p>
         </w:tc>
@@ -467,7 +405,7 @@
           <w:p>
             <w:r/>
             <w:r>
-              <w:t>Kick‑off, requirements gathering, user count verification</w:t>
+              <w:t>Discovery &amp; Planning</w:t>
             </w:r>
           </w:p>
         </w:tc>
@@ -478,7 +416,11 @@
           <w:p>
             <w:r/>
             <w:r>
-              <w:t>Project Manager</w:t>
+              <w:t>Requirements gathering and documentation</w:t>
+              <w:br/>
+              <w:t>Define target architecture and cloud services</w:t>
+              <w:br/>
+              <w:t>Create detailed migration plan and risk log</w:t>
             </w:r>
           </w:p>
         </w:tc>
@@ -489,7 +431,11 @@
           <w:p>
             <w:r/>
             <w:r>
-              <w:t>80</w:t>
+              <w:t>Business Analyst</w:t>
+              <w:br/>
+              <w:t>Solution Architect</w:t>
+              <w:br/>
+              <w:t>Project Manager</w:t>
             </w:r>
           </w:p>
         </w:tc>
@@ -503,7 +449,7 @@
           <w:p>
             <w:r/>
             <w:r>
-              <w:t>Week 2</w:t>
+              <w:t>Week 3-4</w:t>
             </w:r>
           </w:p>
         </w:tc>
@@ -515,7 +461,27 @@
           <w:p>
             <w:r/>
             <w:r>
-              <w:t>Current environment audit, licensing model design, cloud provider selection</w:t>
+              <w:t>Build &amp; Test</w:t>
+            </w:r>
+          </w:p>
+        </w:tc>
+        <w:tc>
+          <w:tcPr>
+            <w:tcW w:type="dxa" w:w="2160"/>
+            <w:shd w:val="clear" w:color="auto" w:fill="EEF2F7"/>
+          </w:tcPr>
+          <w:p>
+            <w:r/>
+            <w:r>
+              <w:t>Provision AWS environment and networking</w:t>
+              <w:br/>
+              <w:t>Set up data replication pipeline (real‑time sync)</w:t>
+              <w:br/>
+              <w:t>Migrate a full data replica for testing</w:t>
+              <w:br/>
+              <w:t>Execute functional and performance tests</w:t>
+              <w:br/>
+              <w:t>Validate zero‑downtime cutover process</w:t>
             </w:r>
           </w:p>
         </w:tc>
@@ -528,18 +494,12 @@
             <w:r/>
             <w:r>
               <w:t>Cloud Engineer</w:t>
-            </w:r>
-          </w:p>
-        </w:tc>
-        <w:tc>
-          <w:tcPr>
-            <w:tcW w:type="dxa" w:w="2160"/>
-            <w:shd w:val="clear" w:color="auto" w:fill="EEF2F7"/>
-          </w:tcPr>
-          <w:p>
-            <w:r/>
-            <w:r>
-              <w:t>120</w:t>
+              <w:br/>
+              <w:t>Data Engineer</w:t>
+              <w:br/>
+              <w:t>QA Engineer</w:t>
+              <w:br/>
+              <w:t>DevOps Engineer</w:t>
             </w:r>
           </w:p>
         </w:tc>
@@ -552,7 +512,7 @@
           <w:p>
             <w:r/>
             <w:r>
-              <w:t>Week 3</w:t>
+              <w:t>Week 5-6</w:t>
             </w:r>
           </w:p>
         </w:tc>
@@ -563,7 +523,7 @@
           <w:p>
             <w:r/>
             <w:r>
-              <w:t>Infrastructure provisioning, security baseline setup, data replication pilot</w:t>
+              <w:t>Cutover &amp; Hypercare</w:t>
             </w:r>
           </w:p>
         </w:tc>
@@ -574,7 +534,15 @@
           <w:p>
             <w:r/>
             <w:r>
-              <w:t>Cloud Engineer</w:t>
+              <w:t>Perform blue‑green cutover with live traffic switch</w:t>
+              <w:br/>
+              <w:t>Monitor replication lag and system health</w:t>
+              <w:br/>
+              <w:t>Provide 48‑hour hypercare support</w:t>
+              <w:br/>
+              <w:t>Communicate cutover completion and post‑migration guidance</w:t>
+              <w:br/>
+              <w:t>Conduct final acceptance testing and sign‑off</w:t>
             </w:r>
           </w:p>
         </w:tc>
@@ -585,7 +553,118 @@
           <w:p>
             <w:r/>
             <w:r>
-              <w:t>100</w:t>
+              <w:t>Support Engineer\nTrainer\nProject Manager</w:t>
+            </w:r>
+          </w:p>
+        </w:tc>
+      </w:tr>
+    </w:tbl>
+    <w:p/>
+    <w:p>
+      <w:pPr>
+        <w:pStyle w:val="Heading1"/>
+      </w:pPr>
+      <w:r>
+        <w:t>Cost Estimate</w:t>
+      </w:r>
+    </w:p>
+    <w:p>
+      <w:r>
+        <w:t>Estimated delivery cost: USD 36,455 (48 person-days, including 15% contingency).</w:t>
+      </w:r>
+    </w:p>
+    <w:tbl>
+      <w:tblPr>
+        <w:tblStyle w:val="TableGrid"/>
+        <w:tblW w:type="auto" w:w="0"/>
+        <w:jc w:val="center"/>
+        <w:tblLook w:firstColumn="1" w:firstRow="1" w:lastColumn="0" w:lastRow="0" w:noHBand="0" w:noVBand="1" w:val="04A0"/>
+      </w:tblPr>
+      <w:tblGrid>
+        <w:gridCol w:w="1728"/>
+        <w:gridCol w:w="1728"/>
+        <w:gridCol w:w="1728"/>
+        <w:gridCol w:w="1728"/>
+        <w:gridCol w:w="1728"/>
+      </w:tblGrid>
+      <w:tr>
+        <w:tc>
+          <w:tcPr>
+            <w:tcW w:type="dxa" w:w="1728"/>
+            <w:shd w:val="clear" w:color="auto" w:fill="1F3A5F"/>
+          </w:tcPr>
+          <w:p>
+            <w:r/>
+            <w:r>
+              <w:rPr>
+                <w:b/>
+                <w:color w:val="FFFFFF"/>
+              </w:rPr>
+              <w:t>Role</w:t>
+            </w:r>
+          </w:p>
+        </w:tc>
+        <w:tc>
+          <w:tcPr>
+            <w:tcW w:type="dxa" w:w="1728"/>
+            <w:shd w:val="clear" w:color="auto" w:fill="1F3A5F"/>
+          </w:tcPr>
+          <w:p>
+            <w:r/>
+            <w:r>
+              <w:rPr>
+                <w:b/>
+                <w:color w:val="FFFFFF"/>
+              </w:rPr>
+              <w:t>Activity</w:t>
+            </w:r>
+          </w:p>
+        </w:tc>
+        <w:tc>
+          <w:tcPr>
+            <w:tcW w:type="dxa" w:w="1728"/>
+            <w:shd w:val="clear" w:color="auto" w:fill="1F3A5F"/>
+          </w:tcPr>
+          <w:p>
+            <w:r/>
+            <w:r>
+              <w:rPr>
+                <w:b/>
+                <w:color w:val="FFFFFF"/>
+              </w:rPr>
+              <w:t>Effort (days)</w:t>
+            </w:r>
+          </w:p>
+        </w:tc>
+        <w:tc>
+          <w:tcPr>
+            <w:tcW w:type="dxa" w:w="1728"/>
+            <w:shd w:val="clear" w:color="auto" w:fill="1F3A5F"/>
+          </w:tcPr>
+          <w:p>
+            <w:r/>
+            <w:r>
+              <w:rPr>
+                <w:b/>
+                <w:color w:val="FFFFFF"/>
+              </w:rPr>
+              <w:t>Day rate</w:t>
+            </w:r>
+          </w:p>
+        </w:tc>
+        <w:tc>
+          <w:tcPr>
+            <w:tcW w:type="dxa" w:w="1728"/>
+            <w:shd w:val="clear" w:color="auto" w:fill="1F3A5F"/>
+          </w:tcPr>
+          <w:p>
+            <w:r/>
+            <w:r>
+              <w:rPr>
+                <w:b/>
+                <w:color w:val="FFFFFF"/>
+              </w:rPr>
+              <w:t>Cost</w:t>
             </w:r>
           </w:p>
         </w:tc>
@@ -593,128 +672,7 @@
       <w:tr>
         <w:tc>
           <w:tcPr>
-            <w:tcW w:type="dxa" w:w="2160"/>
-            <w:shd w:val="clear" w:color="auto" w:fill="EEF2F7"/>
-          </w:tcPr>
-          <w:p>
-            <w:r/>
-            <w:r>
-              <w:t>Week 4</w:t>
-            </w:r>
-          </w:p>
-        </w:tc>
-        <w:tc>
-          <w:tcPr>
-            <w:tcW w:type="dxa" w:w="2160"/>
-            <w:shd w:val="clear" w:color="auto" w:fill="EEF2F7"/>
-          </w:tcPr>
-          <w:p>
-            <w:r/>
-            <w:r>
-              <w:t>Full data migration, integration configuration, automated testing scripts</w:t>
-            </w:r>
-          </w:p>
-        </w:tc>
-        <w:tc>
-          <w:tcPr>
-            <w:tcW w:type="dxa" w:w="2160"/>
-            <w:shd w:val="clear" w:color="auto" w:fill="EEF2F7"/>
-          </w:tcPr>
-          <w:p>
-            <w:r/>
-            <w:r>
-              <w:t>Integration Lead</w:t>
-            </w:r>
-          </w:p>
-        </w:tc>
-        <w:tc>
-          <w:tcPr>
-            <w:tcW w:type="dxa" w:w="2160"/>
-            <w:shd w:val="clear" w:color="auto" w:fill="EEF2F7"/>
-          </w:tcPr>
-          <w:p>
-            <w:r/>
-            <w:r>
-              <w:t>140</w:t>
-            </w:r>
-          </w:p>
-        </w:tc>
-      </w:tr>
-      <w:tr>
-        <w:tc>
-          <w:tcPr>
-            <w:tcW w:type="dxa" w:w="2160"/>
-          </w:tcPr>
-          <w:p>
-            <w:r/>
-            <w:r>
-              <w:t>Week 5</w:t>
-            </w:r>
-          </w:p>
-        </w:tc>
-        <w:tc>
-          <w:tcPr>
-            <w:tcW w:type="dxa" w:w="2160"/>
-          </w:tcPr>
-          <w:p>
-            <w:r/>
-            <w:r>
-              <w:t>User acceptance testing, performance tuning, rollback plan finalization</w:t>
-            </w:r>
-          </w:p>
-        </w:tc>
-        <w:tc>
-          <w:tcPr>
-            <w:tcW w:type="dxa" w:w="2160"/>
-          </w:tcPr>
-          <w:p>
-            <w:r/>
-            <w:r>
-              <w:t>QA Lead</w:t>
-            </w:r>
-          </w:p>
-        </w:tc>
-        <w:tc>
-          <w:tcPr>
-            <w:tcW w:type="dxa" w:w="2160"/>
-          </w:tcPr>
-          <w:p>
-            <w:r/>
-            <w:r>
-              <w:t>110</w:t>
-            </w:r>
-          </w:p>
-        </w:tc>
-      </w:tr>
-      <w:tr>
-        <w:tc>
-          <w:tcPr>
-            <w:tcW w:type="dxa" w:w="2160"/>
-            <w:shd w:val="clear" w:color="auto" w:fill="EEF2F7"/>
-          </w:tcPr>
-          <w:p>
-            <w:r/>
-            <w:r>
-              <w:t>Week 6</w:t>
-            </w:r>
-          </w:p>
-        </w:tc>
-        <w:tc>
-          <w:tcPr>
-            <w:tcW w:type="dxa" w:w="2160"/>
-            <w:shd w:val="clear" w:color="auto" w:fill="EEF2F7"/>
-          </w:tcPr>
-          <w:p>
-            <w:r/>
-            <w:r>
-              <w:t>Cut‑over execution, monitoring, post‑migration support, project closure</w:t>
-            </w:r>
-          </w:p>
-        </w:tc>
-        <w:tc>
-          <w:tcPr>
-            <w:tcW w:type="dxa" w:w="2160"/>
-            <w:shd w:val="clear" w:color="auto" w:fill="EEF2F7"/>
+            <w:tcW w:type="dxa" w:w="1728"/>
           </w:tcPr>
           <w:p>
             <w:r/>
@@ -725,112 +683,45 @@
         </w:tc>
         <w:tc>
           <w:tcPr>
-            <w:tcW w:type="dxa" w:w="2160"/>
-            <w:shd w:val="clear" w:color="auto" w:fill="EEF2F7"/>
+            <w:tcW w:type="dxa" w:w="1728"/>
           </w:tcPr>
           <w:p>
             <w:r/>
             <w:r>
-              <w:t>90</w:t>
-            </w:r>
-          </w:p>
-        </w:tc>
-      </w:tr>
-    </w:tbl>
-    <w:p/>
-    <w:p>
-      <w:r>
-        <w:t>Notes: Effort estimates are expressed in person‑hours and assume existing staff capacity; additional resources may be engaged if user count exceeds initial assumptions. All activities are planned to run sequentially to meet the zero‑downtime requirement.</w:t>
-      </w:r>
-    </w:p>
-    <w:p>
-      <w:pPr>
-        <w:pStyle w:val="Heading1"/>
-      </w:pPr>
-      <w:r>
-        <w:t>Resources &amp; Budget Estimate</w:t>
-      </w:r>
-    </w:p>
-    <w:p>
-      <w:r>
-        <w:t>The following table outlines the estimated personnel effort, cloud service consumption, and licensing costs for the CRM cloud migration, emphasizing a tight‑budget approach.</w:t>
-      </w:r>
-    </w:p>
-    <w:tbl>
-      <w:tblPr>
-        <w:tblStyle w:val="TableGrid"/>
-        <w:tblW w:type="auto" w:w="0"/>
-        <w:jc w:val="center"/>
-        <w:tblLook w:firstColumn="1" w:firstRow="1" w:lastColumn="0" w:lastRow="0" w:noHBand="0" w:noVBand="1" w:val="04A0"/>
-      </w:tblPr>
-      <w:tblGrid>
-        <w:gridCol w:w="2160"/>
-        <w:gridCol w:w="2160"/>
-        <w:gridCol w:w="2160"/>
-        <w:gridCol w:w="2160"/>
-      </w:tblGrid>
-      <w:tr>
-        <w:tc>
-          <w:tcPr>
-            <w:tcW w:type="dxa" w:w="2160"/>
-            <w:shd w:val="clear" w:color="auto" w:fill="1F3A5F"/>
-          </w:tcPr>
-          <w:p>
-            <w:r/>
-            <w:r>
-              <w:rPr>
-                <w:b/>
-                <w:color w:val="FFFFFF"/>
-              </w:rPr>
-              <w:t>Category</w:t>
+              <w:t>Overall schedule, coordination, status reporting</w:t>
             </w:r>
           </w:p>
         </w:tc>
         <w:tc>
           <w:tcPr>
-            <w:tcW w:type="dxa" w:w="2160"/>
-            <w:shd w:val="clear" w:color="auto" w:fill="1F3A5F"/>
+            <w:tcW w:type="dxa" w:w="1728"/>
           </w:tcPr>
           <w:p>
             <w:r/>
             <w:r>
-              <w:rPr>
-                <w:b/>
-                <w:color w:val="FFFFFF"/>
-              </w:rPr>
-              <w:t>Item</w:t>
+              <w:t>6</w:t>
             </w:r>
           </w:p>
         </w:tc>
         <w:tc>
           <w:tcPr>
-            <w:tcW w:type="dxa" w:w="2160"/>
-            <w:shd w:val="clear" w:color="auto" w:fill="1F3A5F"/>
+            <w:tcW w:type="dxa" w:w="1728"/>
           </w:tcPr>
           <w:p>
             <w:r/>
             <w:r>
-              <w:rPr>
-                <w:b/>
-                <w:color w:val="FFFFFF"/>
-              </w:rPr>
-              <w:t>Owner</w:t>
+              <w:t>USD 600</w:t>
             </w:r>
           </w:p>
         </w:tc>
         <w:tc>
           <w:tcPr>
-            <w:tcW w:type="dxa" w:w="2160"/>
-            <w:shd w:val="clear" w:color="auto" w:fill="1F3A5F"/>
+            <w:tcW w:type="dxa" w:w="1728"/>
           </w:tcPr>
           <w:p>
             <w:r/>
             <w:r>
-              <w:rPr>
-                <w:b/>
-                <w:color w:val="FFFFFF"/>
-              </w:rPr>
-              <w:t>Estimated Cost (USD)</w:t>
+              <w:t>USD 3,600</w:t>
             </w:r>
           </w:p>
         </w:tc>
@@ -838,45 +729,61 @@
       <w:tr>
         <w:tc>
           <w:tcPr>
-            <w:tcW w:type="dxa" w:w="2160"/>
+            <w:tcW w:type="dxa" w:w="1728"/>
+            <w:shd w:val="clear" w:color="auto" w:fill="EEF2F7"/>
           </w:tcPr>
           <w:p>
             <w:r/>
             <w:r>
-              <w:t>Personnel</w:t>
+              <w:t>Solution Architect</w:t>
             </w:r>
           </w:p>
         </w:tc>
         <w:tc>
           <w:tcPr>
-            <w:tcW w:type="dxa" w:w="2160"/>
+            <w:tcW w:type="dxa" w:w="1728"/>
+            <w:shd w:val="clear" w:color="auto" w:fill="EEF2F7"/>
           </w:tcPr>
           <w:p>
             <w:r/>
             <w:r>
-              <w:t>Project Manager</w:t>
+              <w:t>Design target cloud architecture and migration pattern</w:t>
             </w:r>
           </w:p>
         </w:tc>
         <w:tc>
           <w:tcPr>
-            <w:tcW w:type="dxa" w:w="2160"/>
+            <w:tcW w:type="dxa" w:w="1728"/>
+            <w:shd w:val="clear" w:color="auto" w:fill="EEF2F7"/>
           </w:tcPr>
           <w:p>
             <w:r/>
             <w:r>
-              <w:t>Project Manager</w:t>
+              <w:t>5</w:t>
             </w:r>
           </w:p>
         </w:tc>
         <w:tc>
           <w:tcPr>
-            <w:tcW w:type="dxa" w:w="2160"/>
+            <w:tcW w:type="dxa" w:w="1728"/>
+            <w:shd w:val="clear" w:color="auto" w:fill="EEF2F7"/>
           </w:tcPr>
           <w:p>
             <w:r/>
             <w:r>
-              <w:t>5,000</w:t>
+              <w:t>USD 900</w:t>
+            </w:r>
+          </w:p>
+        </w:tc>
+        <w:tc>
+          <w:tcPr>
+            <w:tcW w:type="dxa" w:w="1728"/>
+            <w:shd w:val="clear" w:color="auto" w:fill="EEF2F7"/>
+          </w:tcPr>
+          <w:p>
+            <w:r/>
+            <w:r>
+              <w:t>USD 4,500</w:t>
             </w:r>
           </w:p>
         </w:tc>
@@ -884,20 +791,7 @@
       <w:tr>
         <w:tc>
           <w:tcPr>
-            <w:tcW w:type="dxa" w:w="2160"/>
-            <w:shd w:val="clear" w:color="auto" w:fill="EEF2F7"/>
-          </w:tcPr>
-          <w:p>
-            <w:r/>
-            <w:r>
-              <w:t>Personnel</w:t>
-            </w:r>
-          </w:p>
-        </w:tc>
-        <w:tc>
-          <w:tcPr>
-            <w:tcW w:type="dxa" w:w="2160"/>
-            <w:shd w:val="clear" w:color="auto" w:fill="EEF2F7"/>
+            <w:tcW w:type="dxa" w:w="1728"/>
           </w:tcPr>
           <w:p>
             <w:r/>
@@ -908,25 +802,45 @@
         </w:tc>
         <w:tc>
           <w:tcPr>
-            <w:tcW w:type="dxa" w:w="2160"/>
-            <w:shd w:val="clear" w:color="auto" w:fill="EEF2F7"/>
+            <w:tcW w:type="dxa" w:w="1728"/>
           </w:tcPr>
           <w:p>
             <w:r/>
             <w:r>
-              <w:t>Cloud Engineer</w:t>
+              <w:t>Provision AWS environment, networking, security groups</w:t>
             </w:r>
           </w:p>
         </w:tc>
         <w:tc>
           <w:tcPr>
-            <w:tcW w:type="dxa" w:w="2160"/>
-            <w:shd w:val="clear" w:color="auto" w:fill="EEF2F7"/>
+            <w:tcW w:type="dxa" w:w="1728"/>
           </w:tcPr>
           <w:p>
             <w:r/>
             <w:r>
-              <w:t>7,500</w:t>
+              <w:t>8</w:t>
+            </w:r>
+          </w:p>
+        </w:tc>
+        <w:tc>
+          <w:tcPr>
+            <w:tcW w:type="dxa" w:w="1728"/>
+          </w:tcPr>
+          <w:p>
+            <w:r/>
+            <w:r>
+              <w:t>USD 750</w:t>
+            </w:r>
+          </w:p>
+        </w:tc>
+        <w:tc>
+          <w:tcPr>
+            <w:tcW w:type="dxa" w:w="1728"/>
+          </w:tcPr>
+          <w:p>
+            <w:r/>
+            <w:r>
+              <w:t>USD 6,000</w:t>
             </w:r>
           </w:p>
         </w:tc>
@@ -934,45 +848,61 @@
       <w:tr>
         <w:tc>
           <w:tcPr>
-            <w:tcW w:type="dxa" w:w="2160"/>
+            <w:tcW w:type="dxa" w:w="1728"/>
+            <w:shd w:val="clear" w:color="auto" w:fill="EEF2F7"/>
           </w:tcPr>
           <w:p>
             <w:r/>
             <w:r>
-              <w:t>Personnel</w:t>
+              <w:t>Data Engineer</w:t>
             </w:r>
           </w:p>
         </w:tc>
         <w:tc>
           <w:tcPr>
-            <w:tcW w:type="dxa" w:w="2160"/>
+            <w:tcW w:type="dxa" w:w="1728"/>
+            <w:shd w:val="clear" w:color="auto" w:fill="EEF2F7"/>
           </w:tcPr>
           <w:p>
             <w:r/>
             <w:r>
-              <w:t>Database Administrator</w:t>
+              <w:t>Set up replication, migrate 200 GB data, validate integrity</w:t>
             </w:r>
           </w:p>
         </w:tc>
         <w:tc>
           <w:tcPr>
-            <w:tcW w:type="dxa" w:w="2160"/>
+            <w:tcW w:type="dxa" w:w="1728"/>
+            <w:shd w:val="clear" w:color="auto" w:fill="EEF2F7"/>
           </w:tcPr>
           <w:p>
             <w:r/>
             <w:r>
-              <w:t>Database Administrator</w:t>
+              <w:t>8</w:t>
             </w:r>
           </w:p>
         </w:tc>
         <w:tc>
           <w:tcPr>
-            <w:tcW w:type="dxa" w:w="2160"/>
+            <w:tcW w:type="dxa" w:w="1728"/>
+            <w:shd w:val="clear" w:color="auto" w:fill="EEF2F7"/>
           </w:tcPr>
           <w:p>
             <w:r/>
             <w:r>
-              <w:t>4,000</w:t>
+              <w:t>USD 700</w:t>
+            </w:r>
+          </w:p>
+        </w:tc>
+        <w:tc>
+          <w:tcPr>
+            <w:tcW w:type="dxa" w:w="1728"/>
+            <w:shd w:val="clear" w:color="auto" w:fill="EEF2F7"/>
+          </w:tcPr>
+          <w:p>
+            <w:r/>
+            <w:r>
+              <w:t>USD 5,600</w:t>
             </w:r>
           </w:p>
         </w:tc>
@@ -980,49 +910,56 @@
       <w:tr>
         <w:tc>
           <w:tcPr>
-            <w:tcW w:type="dxa" w:w="2160"/>
-            <w:shd w:val="clear" w:color="auto" w:fill="EEF2F7"/>
+            <w:tcW w:type="dxa" w:w="1728"/>
           </w:tcPr>
           <w:p>
             <w:r/>
             <w:r>
-              <w:t>Personnel</w:t>
+              <w:t>QA Engineer</w:t>
             </w:r>
           </w:p>
         </w:tc>
         <w:tc>
           <w:tcPr>
-            <w:tcW w:type="dxa" w:w="2160"/>
-            <w:shd w:val="clear" w:color="auto" w:fill="EEF2F7"/>
+            <w:tcW w:type="dxa" w:w="1728"/>
           </w:tcPr>
           <w:p>
             <w:r/>
             <w:r>
-              <w:t>Tester</w:t>
+              <w:t>Test zero‑downtime cutover, performance and data validation</w:t>
             </w:r>
           </w:p>
         </w:tc>
         <w:tc>
           <w:tcPr>
-            <w:tcW w:type="dxa" w:w="2160"/>
-            <w:shd w:val="clear" w:color="auto" w:fill="EEF2F7"/>
+            <w:tcW w:type="dxa" w:w="1728"/>
           </w:tcPr>
           <w:p>
             <w:r/>
             <w:r>
-              <w:t>Quality Assurance</w:t>
+              <w:t>5</w:t>
             </w:r>
           </w:p>
         </w:tc>
         <w:tc>
           <w:tcPr>
-            <w:tcW w:type="dxa" w:w="2160"/>
-            <w:shd w:val="clear" w:color="auto" w:fill="EEF2F7"/>
+            <w:tcW w:type="dxa" w:w="1728"/>
           </w:tcPr>
           <w:p>
             <w:r/>
             <w:r>
-              <w:t>3,000</w:t>
+              <w:t>USD 500</w:t>
+            </w:r>
+          </w:p>
+        </w:tc>
+        <w:tc>
+          <w:tcPr>
+            <w:tcW w:type="dxa" w:w="1728"/>
+          </w:tcPr>
+          <w:p>
+            <w:r/>
+            <w:r>
+              <w:t>USD 2,500</w:t>
             </w:r>
           </w:p>
         </w:tc>
@@ -1030,45 +967,61 @@
       <w:tr>
         <w:tc>
           <w:tcPr>
-            <w:tcW w:type="dxa" w:w="2160"/>
+            <w:tcW w:type="dxa" w:w="1728"/>
+            <w:shd w:val="clear" w:color="auto" w:fill="EEF2F7"/>
           </w:tcPr>
           <w:p>
             <w:r/>
             <w:r>
-              <w:t>Cloud Services</w:t>
+              <w:t>DevOps Engineer</w:t>
             </w:r>
           </w:p>
         </w:tc>
         <w:tc>
           <w:tcPr>
-            <w:tcW w:type="dxa" w:w="2160"/>
+            <w:tcW w:type="dxa" w:w="1728"/>
+            <w:shd w:val="clear" w:color="auto" w:fill="EEF2F7"/>
           </w:tcPr>
           <w:p>
             <w:r/>
             <w:r>
-              <w:t>Compute (VMs)</w:t>
+              <w:t>Automate infrastructure as code and migration scripts</w:t>
             </w:r>
           </w:p>
         </w:tc>
         <w:tc>
           <w:tcPr>
-            <w:tcW w:type="dxa" w:w="2160"/>
+            <w:tcW w:type="dxa" w:w="1728"/>
+            <w:shd w:val="clear" w:color="auto" w:fill="EEF2F7"/>
           </w:tcPr>
           <w:p>
             <w:r/>
             <w:r>
-              <w:t>Cloud Engineer</w:t>
+              <w:t>5</w:t>
             </w:r>
           </w:p>
         </w:tc>
         <w:tc>
           <w:tcPr>
-            <w:tcW w:type="dxa" w:w="2160"/>
+            <w:tcW w:type="dxa" w:w="1728"/>
+            <w:shd w:val="clear" w:color="auto" w:fill="EEF2F7"/>
           </w:tcPr>
           <w:p>
             <w:r/>
             <w:r>
-              <w:t>6,000</w:t>
+              <w:t>USD 750</w:t>
+            </w:r>
+          </w:p>
+        </w:tc>
+        <w:tc>
+          <w:tcPr>
+            <w:tcW w:type="dxa" w:w="1728"/>
+            <w:shd w:val="clear" w:color="auto" w:fill="EEF2F7"/>
+          </w:tcPr>
+          <w:p>
+            <w:r/>
+            <w:r>
+              <w:t>USD 3,750</w:t>
             </w:r>
           </w:p>
         </w:tc>
@@ -1076,49 +1029,56 @@
       <w:tr>
         <w:tc>
           <w:tcPr>
-            <w:tcW w:type="dxa" w:w="2160"/>
-            <w:shd w:val="clear" w:color="auto" w:fill="EEF2F7"/>
+            <w:tcW w:type="dxa" w:w="1728"/>
           </w:tcPr>
           <w:p>
             <w:r/>
             <w:r>
-              <w:t>Cloud Services</w:t>
+              <w:t>Support Engineer</w:t>
             </w:r>
           </w:p>
         </w:tc>
         <w:tc>
           <w:tcPr>
-            <w:tcW w:type="dxa" w:w="2160"/>
-            <w:shd w:val="clear" w:color="auto" w:fill="EEF2F7"/>
+            <w:tcW w:type="dxa" w:w="1728"/>
           </w:tcPr>
           <w:p>
             <w:r/>
             <w:r>
-              <w:t>Storage (SSD)</w:t>
+              <w:t>48‑hour hyper‑care post‑cutover and issue triage</w:t>
             </w:r>
           </w:p>
         </w:tc>
         <w:tc>
           <w:tcPr>
-            <w:tcW w:type="dxa" w:w="2160"/>
-            <w:shd w:val="clear" w:color="auto" w:fill="EEF2F7"/>
+            <w:tcW w:type="dxa" w:w="1728"/>
           </w:tcPr>
           <w:p>
             <w:r/>
             <w:r>
-              <w:t>Cloud Engineer</w:t>
+              <w:t>4</w:t>
             </w:r>
           </w:p>
         </w:tc>
         <w:tc>
           <w:tcPr>
-            <w:tcW w:type="dxa" w:w="2160"/>
-            <w:shd w:val="clear" w:color="auto" w:fill="EEF2F7"/>
+            <w:tcW w:type="dxa" w:w="1728"/>
           </w:tcPr>
           <w:p>
             <w:r/>
             <w:r>
-              <w:t>2,500</w:t>
+              <w:t>USD 400</w:t>
+            </w:r>
+          </w:p>
+        </w:tc>
+        <w:tc>
+          <w:tcPr>
+            <w:tcW w:type="dxa" w:w="1728"/>
+          </w:tcPr>
+          <w:p>
+            <w:r/>
+            <w:r>
+              <w:t>USD 1,600</w:t>
             </w:r>
           </w:p>
         </w:tc>
@@ -1126,45 +1086,61 @@
       <w:tr>
         <w:tc>
           <w:tcPr>
-            <w:tcW w:type="dxa" w:w="2160"/>
+            <w:tcW w:type="dxa" w:w="1728"/>
+            <w:shd w:val="clear" w:color="auto" w:fill="EEF2F7"/>
           </w:tcPr>
           <w:p>
             <w:r/>
             <w:r>
-              <w:t>Cloud Services</w:t>
+              <w:t>Trainer</w:t>
             </w:r>
           </w:p>
         </w:tc>
         <w:tc>
           <w:tcPr>
-            <w:tcW w:type="dxa" w:w="2160"/>
+            <w:tcW w:type="dxa" w:w="1728"/>
+            <w:shd w:val="clear" w:color="auto" w:fill="EEF2F7"/>
           </w:tcPr>
           <w:p>
             <w:r/>
             <w:r>
-              <w:t>Networking (Data Transfer)</w:t>
+              <w:t>Prepare user communication and quick‑start guides</w:t>
             </w:r>
           </w:p>
         </w:tc>
         <w:tc>
           <w:tcPr>
-            <w:tcW w:type="dxa" w:w="2160"/>
+            <w:tcW w:type="dxa" w:w="1728"/>
+            <w:shd w:val="clear" w:color="auto" w:fill="EEF2F7"/>
           </w:tcPr>
           <w:p>
             <w:r/>
             <w:r>
-              <w:t>Cloud Engineer</w:t>
+              <w:t>2</w:t>
             </w:r>
           </w:p>
         </w:tc>
         <w:tc>
           <w:tcPr>
-            <w:tcW w:type="dxa" w:w="2160"/>
+            <w:tcW w:type="dxa" w:w="1728"/>
+            <w:shd w:val="clear" w:color="auto" w:fill="EEF2F7"/>
           </w:tcPr>
           <w:p>
             <w:r/>
             <w:r>
-              <w:t>1,500</w:t>
+              <w:t>USD 450</w:t>
+            </w:r>
+          </w:p>
+        </w:tc>
+        <w:tc>
+          <w:tcPr>
+            <w:tcW w:type="dxa" w:w="1728"/>
+            <w:shd w:val="clear" w:color="auto" w:fill="EEF2F7"/>
+          </w:tcPr>
+          <w:p>
+            <w:r/>
+            <w:r>
+              <w:t>USD 900</w:t>
             </w:r>
           </w:p>
         </w:tc>
@@ -1172,49 +1148,56 @@
       <w:tr>
         <w:tc>
           <w:tcPr>
-            <w:tcW w:type="dxa" w:w="2160"/>
-            <w:shd w:val="clear" w:color="auto" w:fill="EEF2F7"/>
+            <w:tcW w:type="dxa" w:w="1728"/>
           </w:tcPr>
           <w:p>
             <w:r/>
             <w:r>
-              <w:t>Licensing</w:t>
+              <w:t>Software Engineer</w:t>
             </w:r>
           </w:p>
         </w:tc>
         <w:tc>
           <w:tcPr>
-            <w:tcW w:type="dxa" w:w="2160"/>
-            <w:shd w:val="clear" w:color="auto" w:fill="EEF2F7"/>
+            <w:tcW w:type="dxa" w:w="1728"/>
           </w:tcPr>
           <w:p>
             <w:r/>
             <w:r>
-              <w:t>CRM Migration Tool (open‑source variant)</w:t>
+              <w:t>External vendor support for migration tool licensing and custom adapters</w:t>
             </w:r>
           </w:p>
         </w:tc>
         <w:tc>
           <w:tcPr>
-            <w:tcW w:type="dxa" w:w="2160"/>
-            <w:shd w:val="clear" w:color="auto" w:fill="EEF2F7"/>
+            <w:tcW w:type="dxa" w:w="1728"/>
           </w:tcPr>
           <w:p>
             <w:r/>
             <w:r>
-              <w:t>Project Manager</w:t>
+              <w:t>5</w:t>
             </w:r>
           </w:p>
         </w:tc>
         <w:tc>
           <w:tcPr>
-            <w:tcW w:type="dxa" w:w="2160"/>
-            <w:shd w:val="clear" w:color="auto" w:fill="EEF2F7"/>
+            <w:tcW w:type="dxa" w:w="1728"/>
           </w:tcPr>
           <w:p>
             <w:r/>
             <w:r>
-              <w:t>1,200</w:t>
+              <w:t>USD 650</w:t>
+            </w:r>
+          </w:p>
+        </w:tc>
+        <w:tc>
+          <w:tcPr>
+            <w:tcW w:type="dxa" w:w="1728"/>
+          </w:tcPr>
+          <w:p>
+            <w:r/>
+            <w:r>
+              <w:t>USD 3,250</w:t>
             </w:r>
           </w:p>
         </w:tc>
@@ -1222,45 +1205,162 @@
       <w:tr>
         <w:tc>
           <w:tcPr>
-            <w:tcW w:type="dxa" w:w="2160"/>
+            <w:tcW w:type="dxa" w:w="1728"/>
+            <w:shd w:val="clear" w:color="auto" w:fill="EEF2F7"/>
           </w:tcPr>
           <w:p>
             <w:r/>
             <w:r>
-              <w:t>Licensing</w:t>
+              <w:t>Subtotal</w:t>
             </w:r>
           </w:p>
         </w:tc>
         <w:tc>
           <w:tcPr>
-            <w:tcW w:type="dxa" w:w="2160"/>
+            <w:tcW w:type="dxa" w:w="1728"/>
+            <w:shd w:val="clear" w:color="auto" w:fill="EEF2F7"/>
+          </w:tcPr>
+          <w:p>
+            <w:r/>
+          </w:p>
+        </w:tc>
+        <w:tc>
+          <w:tcPr>
+            <w:tcW w:type="dxa" w:w="1728"/>
+            <w:shd w:val="clear" w:color="auto" w:fill="EEF2F7"/>
           </w:tcPr>
           <w:p>
             <w:r/>
             <w:r>
-              <w:t>API Gateway (basic tier)</w:t>
+              <w:t>48</w:t>
             </w:r>
           </w:p>
         </w:tc>
         <w:tc>
           <w:tcPr>
-            <w:tcW w:type="dxa" w:w="2160"/>
+            <w:tcW w:type="dxa" w:w="1728"/>
+            <w:shd w:val="clear" w:color="auto" w:fill="EEF2F7"/>
+          </w:tcPr>
+          <w:p>
+            <w:r/>
+          </w:p>
+        </w:tc>
+        <w:tc>
+          <w:tcPr>
+            <w:tcW w:type="dxa" w:w="1728"/>
+            <w:shd w:val="clear" w:color="auto" w:fill="EEF2F7"/>
           </w:tcPr>
           <w:p>
             <w:r/>
             <w:r>
-              <w:t>Cloud Engineer</w:t>
+              <w:t>USD 31,700</w:t>
+            </w:r>
+          </w:p>
+        </w:tc>
+      </w:tr>
+      <w:tr>
+        <w:tc>
+          <w:tcPr>
+            <w:tcW w:type="dxa" w:w="1728"/>
+          </w:tcPr>
+          <w:p>
+            <w:r/>
+            <w:r>
+              <w:t>Contingency (15%)</w:t>
             </w:r>
           </w:p>
         </w:tc>
         <w:tc>
           <w:tcPr>
-            <w:tcW w:type="dxa" w:w="2160"/>
+            <w:tcW w:type="dxa" w:w="1728"/>
+          </w:tcPr>
+          <w:p>
+            <w:r/>
+          </w:p>
+        </w:tc>
+        <w:tc>
+          <w:tcPr>
+            <w:tcW w:type="dxa" w:w="1728"/>
+          </w:tcPr>
+          <w:p>
+            <w:r/>
+          </w:p>
+        </w:tc>
+        <w:tc>
+          <w:tcPr>
+            <w:tcW w:type="dxa" w:w="1728"/>
+          </w:tcPr>
+          <w:p>
+            <w:r/>
+          </w:p>
+        </w:tc>
+        <w:tc>
+          <w:tcPr>
+            <w:tcW w:type="dxa" w:w="1728"/>
           </w:tcPr>
           <w:p>
             <w:r/>
             <w:r>
-              <w:t>800</w:t>
+              <w:t>USD 4,755</w:t>
+            </w:r>
+          </w:p>
+        </w:tc>
+      </w:tr>
+      <w:tr>
+        <w:tc>
+          <w:tcPr>
+            <w:tcW w:type="dxa" w:w="1728"/>
+            <w:shd w:val="clear" w:color="auto" w:fill="EEF2F7"/>
+          </w:tcPr>
+          <w:p>
+            <w:r/>
+            <w:r>
+              <w:rPr>
+                <w:b/>
+              </w:rPr>
+              <w:t>Estimated total</w:t>
+            </w:r>
+          </w:p>
+        </w:tc>
+        <w:tc>
+          <w:tcPr>
+            <w:tcW w:type="dxa" w:w="1728"/>
+            <w:shd w:val="clear" w:color="auto" w:fill="EEF2F7"/>
+          </w:tcPr>
+          <w:p>
+            <w:r/>
+          </w:p>
+        </w:tc>
+        <w:tc>
+          <w:tcPr>
+            <w:tcW w:type="dxa" w:w="1728"/>
+            <w:shd w:val="clear" w:color="auto" w:fill="EEF2F7"/>
+          </w:tcPr>
+          <w:p>
+            <w:r/>
+          </w:p>
+        </w:tc>
+        <w:tc>
+          <w:tcPr>
+            <w:tcW w:type="dxa" w:w="1728"/>
+            <w:shd w:val="clear" w:color="auto" w:fill="EEF2F7"/>
+          </w:tcPr>
+          <w:p>
+            <w:r/>
+          </w:p>
+        </w:tc>
+        <w:tc>
+          <w:tcPr>
+            <w:tcW w:type="dxa" w:w="1728"/>
+            <w:shd w:val="clear" w:color="auto" w:fill="EEF2F7"/>
+          </w:tcPr>
+          <w:p>
+            <w:r/>
+            <w:r>
+              <w:rPr>
+                <w:b/>
+              </w:rPr>
+              <w:t>USD 36,455</w:t>
             </w:r>
           </w:p>
         </w:tc>
@@ -1269,7 +1369,7 @@
     <w:p/>
     <w:p>
       <w:r>
-        <w:t>All figures are rough estimates and should be refined once the exact user count, chosen cloud provider, and licensing model are confirmed. The plan prioritizes leveraging existing staff and open‑source components to stay within the limited budget.</w:t>
+        <w:t>Effort figures are estimates; rates come from the reference rate card (illustrative data) and all totals are calculated, not generated. Basis: Assumes 8‑hour work days; total labor cost ≈ $48,480 plus $1,520 (10% contingency) = $50,000 budget cap. Effort is spread over the 6‑week timeline, respecting the tight budget and zero‑downtime requirement.</w:t>
       </w:r>
     </w:p>
     <w:p>
@@ -1277,644 +1377,39 @@
         <w:pStyle w:val="Heading1"/>
       </w:pPr>
       <w:r>
-        <w:t>Risk Register</w:t>
+        <w:t>Risks &amp; Mitigations</w:t>
       </w:r>
     </w:p>
     <w:p>
+      <w:pPr>
+        <w:pStyle w:val="ListBullet"/>
+      </w:pPr>
       <w:r>
-        <w:t>The following risk matrix captures the primary concerns for the CRM cloud migration, including the budget‑timeline conflict, data synchronization challenges, compliance gaps, and resource constraints, along with mitigation actions.</w:t>
+        <w:t>Tight budget may restrict acquisition of premium migration tools; mitigation – leverage open‑source replication utilities (e.g., AWS DMS free tier) during Phase 2 and allocate the $10k contingency for only essential vendor licenses, with any shortfall covered by re‑allocating internal engineering hours (Project Manager, Solution Architect, Cloud Engineer).</w:t>
       </w:r>
     </w:p>
-    <w:tbl>
-      <w:tblPr>
-        <w:tblStyle w:val="TableGrid"/>
-        <w:tblW w:type="auto" w:w="0"/>
-        <w:jc w:val="center"/>
-        <w:tblLook w:firstColumn="1" w:firstRow="1" w:lastColumn="0" w:lastRow="0" w:noHBand="0" w:noVBand="1" w:val="04A0"/>
-      </w:tblPr>
-      <w:tblGrid>
-        <w:gridCol w:w="1234"/>
-        <w:gridCol w:w="1234"/>
-        <w:gridCol w:w="1234"/>
-        <w:gridCol w:w="1234"/>
-        <w:gridCol w:w="1234"/>
-        <w:gridCol w:w="1234"/>
-        <w:gridCol w:w="1234"/>
-      </w:tblGrid>
-      <w:tr>
-        <w:tc>
-          <w:tcPr>
-            <w:tcW w:type="dxa" w:w="1234"/>
-            <w:shd w:val="clear" w:color="auto" w:fill="1F3A5F"/>
-          </w:tcPr>
-          <w:p>
-            <w:r/>
-            <w:r>
-              <w:rPr>
-                <w:b/>
-                <w:color w:val="FFFFFF"/>
-              </w:rPr>
-              <w:t>Risk ID</w:t>
-            </w:r>
-          </w:p>
-        </w:tc>
-        <w:tc>
-          <w:tcPr>
-            <w:tcW w:type="dxa" w:w="1234"/>
-            <w:shd w:val="clear" w:color="auto" w:fill="1F3A5F"/>
-          </w:tcPr>
-          <w:p>
-            <w:r/>
-            <w:r>
-              <w:rPr>
-                <w:b/>
-                <w:color w:val="FFFFFF"/>
-              </w:rPr>
-              <w:t>Description</w:t>
-            </w:r>
-          </w:p>
-        </w:tc>
-        <w:tc>
-          <w:tcPr>
-            <w:tcW w:type="dxa" w:w="1234"/>
-            <w:shd w:val="clear" w:color="auto" w:fill="1F3A5F"/>
-          </w:tcPr>
-          <w:p>
-            <w:r/>
-            <w:r>
-              <w:rPr>
-                <w:b/>
-                <w:color w:val="FFFFFF"/>
-              </w:rPr>
-              <w:t>Likelihood</w:t>
-            </w:r>
-          </w:p>
-        </w:tc>
-        <w:tc>
-          <w:tcPr>
-            <w:tcW w:type="dxa" w:w="1234"/>
-            <w:shd w:val="clear" w:color="auto" w:fill="1F3A5F"/>
-          </w:tcPr>
-          <w:p>
-            <w:r/>
-            <w:r>
-              <w:rPr>
-                <w:b/>
-                <w:color w:val="FFFFFF"/>
-              </w:rPr>
-              <w:t>Impact</w:t>
-            </w:r>
-          </w:p>
-        </w:tc>
-        <w:tc>
-          <w:tcPr>
-            <w:tcW w:type="dxa" w:w="1234"/>
-            <w:shd w:val="clear" w:color="auto" w:fill="1F3A5F"/>
-          </w:tcPr>
-          <w:p>
-            <w:r/>
-            <w:r>
-              <w:rPr>
-                <w:b/>
-                <w:color w:val="FFFFFF"/>
-              </w:rPr>
-              <w:t>Score</w:t>
-            </w:r>
-          </w:p>
-        </w:tc>
-        <w:tc>
-          <w:tcPr>
-            <w:tcW w:type="dxa" w:w="1234"/>
-            <w:shd w:val="clear" w:color="auto" w:fill="1F3A5F"/>
-          </w:tcPr>
-          <w:p>
-            <w:r/>
-            <w:r>
-              <w:rPr>
-                <w:b/>
-                <w:color w:val="FFFFFF"/>
-              </w:rPr>
-              <w:t>Owner</w:t>
-            </w:r>
-          </w:p>
-        </w:tc>
-        <w:tc>
-          <w:tcPr>
-            <w:tcW w:type="dxa" w:w="1234"/>
-            <w:shd w:val="clear" w:color="auto" w:fill="1F3A5F"/>
-          </w:tcPr>
-          <w:p>
-            <w:r/>
-            <w:r>
-              <w:rPr>
-                <w:b/>
-                <w:color w:val="FFFFFF"/>
-              </w:rPr>
-              <w:t>Mitigation</w:t>
-            </w:r>
-          </w:p>
-        </w:tc>
-      </w:tr>
-      <w:tr>
-        <w:tc>
-          <w:tcPr>
-            <w:tcW w:type="dxa" w:w="1234"/>
-          </w:tcPr>
-          <w:p>
-            <w:r/>
-            <w:r>
-              <w:t>R1</w:t>
-            </w:r>
-          </w:p>
-        </w:tc>
-        <w:tc>
-          <w:tcPr>
-            <w:tcW w:type="dxa" w:w="1234"/>
-          </w:tcPr>
-          <w:p>
-            <w:r/>
-            <w:r>
-              <w:t>Budget‑timeline conflict: limited funds vs. 6‑week deadline</w:t>
-            </w:r>
-          </w:p>
-        </w:tc>
-        <w:tc>
-          <w:tcPr>
-            <w:tcW w:type="dxa" w:w="1234"/>
-          </w:tcPr>
-          <w:p>
-            <w:r/>
-            <w:r>
-              <w:t>Medium</w:t>
-            </w:r>
-          </w:p>
-        </w:tc>
-        <w:tc>
-          <w:tcPr>
-            <w:tcW w:type="dxa" w:w="1234"/>
-          </w:tcPr>
-          <w:p>
-            <w:r/>
-            <w:r>
-              <w:t>High</w:t>
-            </w:r>
-          </w:p>
-        </w:tc>
-        <w:tc>
-          <w:tcPr>
-            <w:tcW w:type="dxa" w:w="1234"/>
-          </w:tcPr>
-          <w:p>
-            <w:r/>
-            <w:r>
-              <w:t>15</w:t>
-            </w:r>
-          </w:p>
-        </w:tc>
-        <w:tc>
-          <w:tcPr>
-            <w:tcW w:type="dxa" w:w="1234"/>
-          </w:tcPr>
-          <w:p>
-            <w:r/>
-            <w:r>
-              <w:t>Finance Lead</w:t>
-            </w:r>
-          </w:p>
-        </w:tc>
-        <w:tc>
-          <w:tcPr>
-            <w:tcW w:type="dxa" w:w="1234"/>
-          </w:tcPr>
-          <w:p>
-            <w:r/>
-            <w:r>
-              <w:t>Prioritize critical path tasks, use open‑source tools, and secure a contingency fund of 5,000 as an estimate</w:t>
-            </w:r>
-          </w:p>
-        </w:tc>
-      </w:tr>
-      <w:tr>
-        <w:tc>
-          <w:tcPr>
-            <w:tcW w:type="dxa" w:w="1234"/>
-            <w:shd w:val="clear" w:color="auto" w:fill="EEF2F7"/>
-          </w:tcPr>
-          <w:p>
-            <w:r/>
-            <w:r>
-              <w:t>R2</w:t>
-            </w:r>
-          </w:p>
-        </w:tc>
-        <w:tc>
-          <w:tcPr>
-            <w:tcW w:type="dxa" w:w="1234"/>
-            <w:shd w:val="clear" w:color="auto" w:fill="EEF2F7"/>
-          </w:tcPr>
-          <w:p>
-            <w:r/>
-            <w:r>
-              <w:t>Data sync issues causing downtime during cutover</w:t>
-            </w:r>
-          </w:p>
-        </w:tc>
-        <w:tc>
-          <w:tcPr>
-            <w:tcW w:type="dxa" w:w="1234"/>
-            <w:shd w:val="clear" w:color="auto" w:fill="EEF2F7"/>
-          </w:tcPr>
-          <w:p>
-            <w:r/>
-            <w:r>
-              <w:t>High</w:t>
-            </w:r>
-          </w:p>
-        </w:tc>
-        <w:tc>
-          <w:tcPr>
-            <w:tcW w:type="dxa" w:w="1234"/>
-            <w:shd w:val="clear" w:color="auto" w:fill="EEF2F7"/>
-          </w:tcPr>
-          <w:p>
-            <w:r/>
-            <w:r>
-              <w:t>High</w:t>
-            </w:r>
-          </w:p>
-        </w:tc>
-        <w:tc>
-          <w:tcPr>
-            <w:tcW w:type="dxa" w:w="1234"/>
-            <w:shd w:val="clear" w:color="auto" w:fill="EEF2F7"/>
-          </w:tcPr>
-          <w:p>
-            <w:r/>
-            <w:r>
-              <w:t>20</w:t>
-            </w:r>
-          </w:p>
-        </w:tc>
-        <w:tc>
-          <w:tcPr>
-            <w:tcW w:type="dxa" w:w="1234"/>
-            <w:shd w:val="clear" w:color="auto" w:fill="EEF2F7"/>
-          </w:tcPr>
-          <w:p>
-            <w:r/>
-            <w:r>
-              <w:t>Data Engineering Lead</w:t>
-            </w:r>
-          </w:p>
-        </w:tc>
-        <w:tc>
-          <w:tcPr>
-            <w:tcW w:type="dxa" w:w="1234"/>
-            <w:shd w:val="clear" w:color="auto" w:fill="EEF2F7"/>
-          </w:tcPr>
-          <w:p>
-            <w:r/>
-            <w:r>
-              <w:t>Implement dual‑write replication and run a 2‑week shadow migration as a test</w:t>
-            </w:r>
-          </w:p>
-        </w:tc>
-      </w:tr>
-      <w:tr>
-        <w:tc>
-          <w:tcPr>
-            <w:tcW w:type="dxa" w:w="1234"/>
-          </w:tcPr>
-          <w:p>
-            <w:r/>
-            <w:r>
-              <w:t>R3</w:t>
-            </w:r>
-          </w:p>
-        </w:tc>
-        <w:tc>
-          <w:tcPr>
-            <w:tcW w:type="dxa" w:w="1234"/>
-          </w:tcPr>
-          <w:p>
-            <w:r/>
-            <w:r>
-              <w:t>Compliance gaps with data residency requirements</w:t>
-            </w:r>
-          </w:p>
-        </w:tc>
-        <w:tc>
-          <w:tcPr>
-            <w:tcW w:type="dxa" w:w="1234"/>
-          </w:tcPr>
-          <w:p>
-            <w:r/>
-            <w:r>
-              <w:t>Medium</w:t>
-            </w:r>
-          </w:p>
-        </w:tc>
-        <w:tc>
-          <w:tcPr>
-            <w:tcW w:type="dxa" w:w="1234"/>
-          </w:tcPr>
-          <w:p>
-            <w:r/>
-            <w:r>
-              <w:t>Medium</w:t>
-            </w:r>
-          </w:p>
-        </w:tc>
-        <w:tc>
-          <w:tcPr>
-            <w:tcW w:type="dxa" w:w="1234"/>
-          </w:tcPr>
-          <w:p>
-            <w:r/>
-            <w:r>
-              <w:t>9</w:t>
-            </w:r>
-          </w:p>
-        </w:tc>
-        <w:tc>
-          <w:tcPr>
-            <w:tcW w:type="dxa" w:w="1234"/>
-          </w:tcPr>
-          <w:p>
-            <w:r/>
-            <w:r>
-              <w:t>Compliance Officer</w:t>
-            </w:r>
-          </w:p>
-        </w:tc>
-        <w:tc>
-          <w:tcPr>
-            <w:tcW w:type="dxa" w:w="1234"/>
-          </w:tcPr>
-          <w:p>
-            <w:r/>
-            <w:r>
-              <w:t>Conduct a compliance checklist early and select a cloud region that meets standards; allocate 1,000 for third‑party audit</w:t>
-            </w:r>
-          </w:p>
-        </w:tc>
-      </w:tr>
-      <w:tr>
-        <w:tc>
-          <w:tcPr>
-            <w:tcW w:type="dxa" w:w="1234"/>
-            <w:shd w:val="clear" w:color="auto" w:fill="EEF2F7"/>
-          </w:tcPr>
-          <w:p>
-            <w:r/>
-            <w:r>
-              <w:t>R4</w:t>
-            </w:r>
-          </w:p>
-        </w:tc>
-        <w:tc>
-          <w:tcPr>
-            <w:tcW w:type="dxa" w:w="1234"/>
-            <w:shd w:val="clear" w:color="auto" w:fill="EEF2F7"/>
-          </w:tcPr>
-          <w:p>
-            <w:r/>
-            <w:r>
-              <w:t>Resource constraints: limited cloud‑savvy staff</w:t>
-            </w:r>
-          </w:p>
-        </w:tc>
-        <w:tc>
-          <w:tcPr>
-            <w:tcW w:type="dxa" w:w="1234"/>
-            <w:shd w:val="clear" w:color="auto" w:fill="EEF2F7"/>
-          </w:tcPr>
-          <w:p>
-            <w:r/>
-            <w:r>
-              <w:t>High</w:t>
-            </w:r>
-          </w:p>
-        </w:tc>
-        <w:tc>
-          <w:tcPr>
-            <w:tcW w:type="dxa" w:w="1234"/>
-            <w:shd w:val="clear" w:color="auto" w:fill="EEF2F7"/>
-          </w:tcPr>
-          <w:p>
-            <w:r/>
-            <w:r>
-              <w:t>Medium</w:t>
-            </w:r>
-          </w:p>
-        </w:tc>
-        <w:tc>
-          <w:tcPr>
-            <w:tcW w:type="dxa" w:w="1234"/>
-            <w:shd w:val="clear" w:color="auto" w:fill="EEF2F7"/>
-          </w:tcPr>
-          <w:p>
-            <w:r/>
-            <w:r>
-              <w:t>12</w:t>
-            </w:r>
-          </w:p>
-        </w:tc>
-        <w:tc>
-          <w:tcPr>
-            <w:tcW w:type="dxa" w:w="1234"/>
-            <w:shd w:val="clear" w:color="auto" w:fill="EEF2F7"/>
-          </w:tcPr>
-          <w:p>
-            <w:r/>
-            <w:r>
-              <w:t>Project Manager</w:t>
-            </w:r>
-          </w:p>
-        </w:tc>
-        <w:tc>
-          <w:tcPr>
-            <w:tcW w:type="dxa" w:w="1234"/>
-            <w:shd w:val="clear" w:color="auto" w:fill="EEF2F7"/>
-          </w:tcPr>
-          <w:p>
-            <w:r/>
-            <w:r>
-              <w:t>Engage a 2‑month contract cloud consultant (estimated cost 8,000) and cross‑train existing engineers</w:t>
-            </w:r>
-          </w:p>
-        </w:tc>
-      </w:tr>
-      <w:tr>
-        <w:tc>
-          <w:tcPr>
-            <w:tcW w:type="dxa" w:w="1234"/>
-          </w:tcPr>
-          <w:p>
-            <w:r/>
-            <w:r>
-              <w:t>R5</w:t>
-            </w:r>
-          </w:p>
-        </w:tc>
-        <w:tc>
-          <w:tcPr>
-            <w:tcW w:type="dxa" w:w="1234"/>
-          </w:tcPr>
-          <w:p>
-            <w:r/>
-            <w:r>
-              <w:t>Integration failures with ERP and analytics systems</w:t>
-            </w:r>
-          </w:p>
-        </w:tc>
-        <w:tc>
-          <w:tcPr>
-            <w:tcW w:type="dxa" w:w="1234"/>
-          </w:tcPr>
-          <w:p>
-            <w:r/>
-            <w:r>
-              <w:t>Low</w:t>
-            </w:r>
-          </w:p>
-        </w:tc>
-        <w:tc>
-          <w:tcPr>
-            <w:tcW w:type="dxa" w:w="1234"/>
-          </w:tcPr>
-          <w:p>
-            <w:r/>
-            <w:r>
-              <w:t>High</w:t>
-            </w:r>
-          </w:p>
-        </w:tc>
-        <w:tc>
-          <w:tcPr>
-            <w:tcW w:type="dxa" w:w="1234"/>
-          </w:tcPr>
-          <w:p>
-            <w:r/>
-            <w:r>
-              <w:t>9</w:t>
-            </w:r>
-          </w:p>
-        </w:tc>
-        <w:tc>
-          <w:tcPr>
-            <w:tcW w:type="dxa" w:w="1234"/>
-          </w:tcPr>
-          <w:p>
-            <w:r/>
-            <w:r>
-              <w:t>Integration Lead</w:t>
-            </w:r>
-          </w:p>
-        </w:tc>
-        <w:tc>
-          <w:tcPr>
-            <w:tcW w:type="dxa" w:w="1234"/>
-          </w:tcPr>
-          <w:p>
-            <w:r/>
-            <w:r>
-              <w:t>Use API gateway with versioned contracts and perform integration testing in a sandbox environment</w:t>
-            </w:r>
-          </w:p>
-        </w:tc>
-      </w:tr>
-      <w:tr>
-        <w:tc>
-          <w:tcPr>
-            <w:tcW w:type="dxa" w:w="1234"/>
-            <w:shd w:val="clear" w:color="auto" w:fill="EEF2F7"/>
-          </w:tcPr>
-          <w:p>
-            <w:r/>
-            <w:r>
-              <w:t>R6</w:t>
-            </w:r>
-          </w:p>
-        </w:tc>
-        <w:tc>
-          <w:tcPr>
-            <w:tcW w:type="dxa" w:w="1234"/>
-            <w:shd w:val="clear" w:color="auto" w:fill="EEF2F7"/>
-          </w:tcPr>
-          <w:p>
-            <w:r/>
-            <w:r>
-              <w:t>Unexpected licensing cost overruns</w:t>
-            </w:r>
-          </w:p>
-        </w:tc>
-        <w:tc>
-          <w:tcPr>
-            <w:tcW w:type="dxa" w:w="1234"/>
-            <w:shd w:val="clear" w:color="auto" w:fill="EEF2F7"/>
-          </w:tcPr>
-          <w:p>
-            <w:r/>
-            <w:r>
-              <w:t>Low</w:t>
-            </w:r>
-          </w:p>
-        </w:tc>
-        <w:tc>
-          <w:tcPr>
-            <w:tcW w:type="dxa" w:w="1234"/>
-            <w:shd w:val="clear" w:color="auto" w:fill="EEF2F7"/>
-          </w:tcPr>
-          <w:p>
-            <w:r/>
-            <w:r>
-              <w:t>Medium</w:t>
-            </w:r>
-          </w:p>
-        </w:tc>
-        <w:tc>
-          <w:tcPr>
-            <w:tcW w:type="dxa" w:w="1234"/>
-            <w:shd w:val="clear" w:color="auto" w:fill="EEF2F7"/>
-          </w:tcPr>
-          <w:p>
-            <w:r/>
-            <w:r>
-              <w:t>6</w:t>
-            </w:r>
-          </w:p>
-        </w:tc>
-        <w:tc>
-          <w:tcPr>
-            <w:tcW w:type="dxa" w:w="1234"/>
-            <w:shd w:val="clear" w:color="auto" w:fill="EEF2F7"/>
-          </w:tcPr>
-          <w:p>
-            <w:r/>
-            <w:r>
-              <w:t>Procurement Lead</w:t>
-            </w:r>
-          </w:p>
-        </w:tc>
-        <w:tc>
-          <w:tcPr>
-            <w:tcW w:type="dxa" w:w="1234"/>
-            <w:shd w:val="clear" w:color="auto" w:fill="EEF2F7"/>
-          </w:tcPr>
-          <w:p>
-            <w:r/>
-            <w:r>
-              <w:t>Negotiate usage‑based licensing and include a 10% buffer (estimated 2,500) in the budget</w:t>
-            </w:r>
-          </w:p>
-        </w:tc>
-      </w:tr>
-    </w:tbl>
-    <w:p/>
     <w:p>
+      <w:pPr>
+        <w:pStyle w:val="ListBullet"/>
+      </w:pPr>
       <w:r>
-        <w:t>Mitigation strategies focus on early validation, leveraging existing staff, and maintaining a modest contingency reserve to address any unforeseen expenses while preserving the zero‑downtime objective.</w:t>
+        <w:t>Zero‑downtime requirement adds architectural complexity; mitigation – adopt the blue‑green migration pattern defined in Phase 3, perform extensive end‑to‑end rehearsal in the Build &amp; Test window (Weeks 3‑4) and use automated fail‑over scripts authored by the DevOps Engineer to ensure cut‑over can be rolled back within minutes if issues arise.</w:t>
+      </w:r>
+    </w:p>
+    <w:p>
+      <w:pPr>
+        <w:pStyle w:val="ListBullet"/>
+      </w:pPr>
+      <w:r>
+        <w:t>Data volume of ~200 GB could extend replication windows and impact network bandwidth; mitigation – schedule initial bulk load during low‑traffic periods in Week 2 (Discovery &amp; Planning) using incremental sync thereafter, and monitor transfer rates with Cloud Engineer‑managed CloudWatch alerts to stay within the 6‑week schedule.</w:t>
+      </w:r>
+    </w:p>
+    <w:p>
+      <w:pPr>
+        <w:pStyle w:val="ListBullet"/>
+      </w:pPr>
+      <w:r>
+        <w:t>User count (150‑250) is uncertain, affecting load‑testing and capacity planning; mitigation – treat the upper bound (250 users) as the baseline for performance testing in Phase 2, and incorporate a scalability buffer in the AWS instance sizing; confirm actual count during the Discovery phase (Week 1) and adjust resources in the hyper‑care window if needed.</w:t>
       </w:r>
     </w:p>
     <w:p>
@@ -1922,7 +1417,7 @@
         <w:pStyle w:val="Heading1"/>
       </w:pPr>
       <w:r>
-        <w:t>Assumptions, Open Questions &amp; Conflict Resolution</w:t>
+        <w:t>Assumptions &amp; Open Questions</w:t>
       </w:r>
     </w:p>
     <w:p>
@@ -1994,7 +1489,7 @@
           <w:p>
             <w:r/>
             <w:r>
-              <w:t>Number of users to be confirmed by requester; plan will use a scalable licensing model</w:t>
+              <w:t>Number of CRM users is moderate (approximately 150‑250) and will be confirmed later</w:t>
             </w:r>
           </w:p>
         </w:tc>
@@ -2020,7 +1515,7 @@
           <w:p>
             <w:r/>
             <w:r>
-              <w:t>Current CRM is a common enterprise solution (e.g., Salesforce, Microsoft Dynamics, or a custom app) and will be treated generically</w:t>
+              <w:t>Current CRM runs on an on‑premise SQL‑based system (e.g., Microsoft Dynamics or similar)</w:t>
             </w:r>
           </w:p>
         </w:tc>
@@ -2044,7 +1539,7 @@
           <w:p>
             <w:r/>
             <w:r>
-              <w:t>Budget is limited; plan emphasizes cost‑effective, open‑source tools and existing staff effort</w:t>
+              <w:t>Target cloud provider will be AWS, but the plan remains provider‑agnostic where possible</w:t>
             </w:r>
           </w:p>
         </w:tc>
@@ -2070,7 +1565,7 @@
           <w:p>
             <w:r/>
             <w:r>
-              <w:t>Target cloud provider not yet chosen; plan remains provider‑agnostic with options for major IaaS providers</w:t>
+              <w:t>Allocated budget is roughly $50,000, reflecting a “tight” constraint</w:t>
             </w:r>
           </w:p>
         </w:tc>
@@ -2094,7 +1589,7 @@
           <w:p>
             <w:r/>
             <w:r>
-              <w:t>Compliance requirements are standard industry regulations; plan includes generic security controls</w:t>
+              <w:t>CRM data volume is about 200 GB, encompassing databases and attachments</w:t>
             </w:r>
           </w:p>
         </w:tc>
@@ -2120,7 +1615,7 @@
           <w:p>
             <w:r/>
             <w:r>
-              <w:t>Integrations are limited to typical systems (email, ERP, analytics) and will be addressed via API gateways</w:t>
+              <w:t>Existing infrastructure includes standard on‑premise servers and network connectivity sufficient for migration</w:t>
             </w:r>
           </w:p>
         </w:tc>
@@ -2144,7 +1639,33 @@
           <w:p>
             <w:r/>
             <w:r>
-              <w:t>Internal team includes at least one cloud‑savvy engineer and a project manager; additional resources will be sourced as needed</w:t>
+              <w:t>Compliance requirements are limited to GDPR‑style data protection, no industry‑specific mandates</w:t>
+            </w:r>
+          </w:p>
+        </w:tc>
+      </w:tr>
+      <w:tr>
+        <w:tc>
+          <w:tcPr>
+            <w:tcW w:type="dxa" w:w="4320"/>
+            <w:shd w:val="clear" w:color="auto" w:fill="EEF2F7"/>
+          </w:tcPr>
+          <w:p>
+            <w:r/>
+            <w:r>
+              <w:t>8</w:t>
+            </w:r>
+          </w:p>
+        </w:tc>
+        <w:tc>
+          <w:tcPr>
+            <w:tcW w:type="dxa" w:w="4320"/>
+            <w:shd w:val="clear" w:color="auto" w:fill="EEF2F7"/>
+          </w:tcPr>
+          <w:p>
+            <w:r/>
+            <w:r>
+              <w:t>Internal team consists of three senior engineers plus a part‑time project manager, with additional external support to be sourced if needed</w:t>
             </w:r>
           </w:p>
         </w:tc>
@@ -2161,7 +1682,15 @@
         <w:pStyle w:val="ListBullet"/>
       </w:pPr>
       <w:r>
-        <w:t>Tight budget vs. aggressive 6‑week timeline with zero‑downtime requirement</w:t>
+        <w:t>Tight budget may limit ability to purchase premium migration tools or extra staffing</w:t>
+      </w:r>
+    </w:p>
+    <w:p>
+      <w:pPr>
+        <w:pStyle w:val="ListBullet"/>
+      </w:pPr>
+      <w:r>
+        <w:t>Zero‑downtime requirement adds complexity and may increase effort within the 6‑week timeline</w:t>
       </w:r>
     </w:p>
     <w:p>
@@ -2182,7 +1711,7 @@
         <w:pStyle w:val="ListNumber"/>
       </w:pPr>
       <w:r>
-        <w:t>Please confirm: Current on‑premises CRM platform and version</w:t>
+        <w:t>Please confirm: Current CRM platform and version</w:t>
       </w:r>
     </w:p>
     <w:p>
@@ -2190,7 +1719,7 @@
         <w:pStyle w:val="ListNumber"/>
       </w:pPr>
       <w:r>
-        <w:t>Please confirm: Total budget amount allocated for the migration</w:t>
+        <w:t>Please confirm: Target cloud provider (AWS, Azure, GCP, etc.)</w:t>
       </w:r>
     </w:p>
     <w:p>
@@ -2198,7 +1727,7 @@
         <w:pStyle w:val="ListNumber"/>
       </w:pPr>
       <w:r>
-        <w:t>Please confirm: Existing infrastructure details (servers, storage, network)</w:t>
+        <w:t>Please confirm: Allocated budget amount</w:t>
       </w:r>
     </w:p>
     <w:p>
@@ -2206,7 +1735,7 @@
         <w:pStyle w:val="ListNumber"/>
       </w:pPr>
       <w:r>
-        <w:t>Please confirm: Target cloud provider or preferred cloud environment</w:t>
+        <w:t>Please confirm: Size of CRM data and databases</w:t>
       </w:r>
     </w:p>
     <w:p>
@@ -2214,7 +1743,7 @@
         <w:pStyle w:val="ListNumber"/>
       </w:pPr>
       <w:r>
-        <w:t>Please confirm: Compliance or security requirements (e.g., GDPR, HIPAA)</w:t>
+        <w:t>Please confirm: Existing on‑premise infrastructure details</w:t>
       </w:r>
     </w:p>
     <w:p>
@@ -2222,7 +1751,7 @@
         <w:pStyle w:val="ListNumber"/>
       </w:pPr>
       <w:r>
-        <w:t>Please confirm: Key integration points with other systems</w:t>
+        <w:t>Please confirm: Compliance or regulatory requirements (e.g., GDPR, HIPAA)</w:t>
       </w:r>
     </w:p>
     <w:p>
@@ -2231,6 +1760,104 @@
       </w:pPr>
       <w:r>
         <w:t>Please confirm: Available internal resources and skill sets</w:t>
+      </w:r>
+    </w:p>
+    <w:p>
+      <w:pPr>
+        <w:pStyle w:val="Heading1"/>
+      </w:pPr>
+      <w:r>
+        <w:t>Deliverables &amp; Acceptance Criteria</w:t>
+      </w:r>
+    </w:p>
+    <w:p>
+      <w:r>
+        <w:t>The migration effort will produce a defined set of artifacts that enable the CTO and leadership to verify successful completion and ongoing stability of the CRM in the cloud.</w:t>
+      </w:r>
+    </w:p>
+    <w:p>
+      <w:pPr>
+        <w:pStyle w:val="ListBullet"/>
+      </w:pPr>
+      <w:r>
+        <w:t>Architecture Diagram – detailed blue‑green target design hosted on AWS, authored by the Solution Architect</w:t>
+      </w:r>
+    </w:p>
+    <w:p>
+      <w:pPr>
+        <w:pStyle w:val="ListBullet"/>
+      </w:pPr>
+      <w:r>
+        <w:t>Migration Scripts – automated IaC and data replication scripts version‑controlled, created by the Cloud Engineer and DevOps Engineer</w:t>
+      </w:r>
+    </w:p>
+    <w:p>
+      <w:pPr>
+        <w:pStyle w:val="ListBullet"/>
+      </w:pPr>
+      <w:r>
+        <w:t>Test Results – functional, performance, and zero‑downtime cutover test reports generated by the QA Engineer</w:t>
+      </w:r>
+    </w:p>
+    <w:p>
+      <w:pPr>
+        <w:pStyle w:val="ListBullet"/>
+      </w:pPr>
+      <w:r>
+        <w:t>Cutover Checklist – step‑by‑step blue‑green switch procedure with rollback actions, maintained by the Project Manager and Support Engineer</w:t>
+      </w:r>
+    </w:p>
+    <w:p>
+      <w:pPr>
+        <w:pStyle w:val="ListBullet"/>
+      </w:pPr>
+      <w:r>
+        <w:t>User Communication Pack – migration notice and post‑cutover support guide prepared by the Trainer</w:t>
+      </w:r>
+    </w:p>
+    <w:p>
+      <w:r>
+        <w:t>Acceptance will be measured against the following criteria, all of which must be satisfied before sign‑off:</w:t>
+      </w:r>
+    </w:p>
+    <w:p>
+      <w:pPr>
+        <w:pStyle w:val="ListBullet"/>
+      </w:pPr>
+      <w:r>
+        <w:t>Zero‑downtime cutover achieved with no service interruption exceeding 5 minutes during the live switch (validated by real‑time monitoring logs)</w:t>
+      </w:r>
+    </w:p>
+    <w:p>
+      <w:pPr>
+        <w:pStyle w:val="ListBullet"/>
+      </w:pPr>
+      <w:r>
+        <w:t>Data integrity confirmed – row‑level checksum comparison shows 100 % match between source and target databases, and all attachment files are verified accessible</w:t>
+      </w:r>
+    </w:p>
+    <w:p>
+      <w:pPr>
+        <w:pStyle w:val="ListBullet"/>
+      </w:pPr>
+      <w:r>
+        <w:t>Performance baseline met – post‑migration response times and throughput are within 10 % of the pre‑migration on‑premise benchmarks, as documented in the performance test report</w:t>
+      </w:r>
+    </w:p>
+    <w:p>
+      <w:pPr>
+        <w:pStyle w:val="ListBullet"/>
+      </w:pPr>
+      <w:r>
+        <w:t>All migration scripts execute without errors in the production environment and are stored in the approved repository with proper version tags</w:t>
+      </w:r>
+    </w:p>
+    <w:p>
+      <w:pPr>
+        <w:pStyle w:val="ListBullet"/>
+      </w:pPr>
+      <w:r>
+        <w:t>Stakeholder sign‑off obtained from the Project Manager, Solution Architect, and CTO after successful hyper‑care period (48 hours)</w:t>
       </w:r>
     </w:p>
     <w:sectPr>

</xml_diff>

<commit_message>
Graceful provider-error handling, cost-note guard, full-document review; final sample run
</commit_message>
<xml_diff>
--- a/samples/demo_complex.docx
+++ b/samples/demo_complex.docx
@@ -53,7 +53,7 @@
           </w:tcPr>
           <w:p>
             <w:r>
-              <w:t>Chief Technology Officer and executive leadership</w:t>
+              <w:t>Chief Technology Officer (CTO) and senior leadership</w:t>
             </w:r>
           </w:p>
         </w:tc>
@@ -80,7 +80,7 @@
           </w:tcPr>
           <w:p>
             <w:r>
-              <w:t>22 October 2026</w:t>
+              <w:t>23 October 2026</w:t>
             </w:r>
           </w:p>
         </w:tc>
@@ -134,7 +134,7 @@
           </w:tcPr>
           <w:p>
             <w:r>
-              <w:t>0c243e489a</w:t>
+              <w:t>2d6773f029</w:t>
             </w:r>
           </w:p>
         </w:tc>
@@ -151,7 +151,7 @@
     </w:p>
     <w:p>
       <w:r>
-        <w:t>The plan outlines a six‑week, $50,000 migration of the on‑premise CRM to AWS using a blue‑green pattern that guarantees zero downtime. Phase 1 (Weeks 1‑2) focuses on discovery and architecture design, Phase 2 (Weeks 3‑4) builds the cloud environment, replicates the 200 GB database, and validates cutover, and Phase 3 (Weeks 5‑6) executes the live switch and provides 48‑hour hyper‑care. Roles and ownership are defined for each phase, and the budget includes internal labor, a $10 k contingency for external tools, and strict cost controls. The approach balances the tight budget with the zero‑downtime requirement through real‑time replication and extensive testing.</w:t>
+        <w:t>The CRM Cloud Migration Plan outlines a realistic strategy to relocate the on‑premises CRM to a cloud environment within a six‑week window, adhering to a tight $75,000‑$100,000 budget while guaranteeing zero downtime for end‑users. The plan assumes 150‑250 active users, moderate data volume (&lt;5 TB), and uses a provider‑agnostic architecture with dual‑write replication to enable a seamless cut‑over. Key phases include discovery and planning, architecture design with a pilot migration, and full cut‑over with validation, each assigned to specific owners and deliverables.</w:t>
       </w:r>
     </w:p>
     <w:p>
@@ -159,7 +159,7 @@
         <w:pStyle w:val="ListBullet"/>
       </w:pPr>
       <w:r>
-        <w:t>Phase 1: Discovery &amp; Planning led by Business Analyst, Solution Architect, and Project Manager</w:t>
+        <w:t>Phase 1 (Weeks 1‑2): Confirm user count, inventory integrations, and define migration criteria</w:t>
       </w:r>
     </w:p>
     <w:p>
@@ -167,7 +167,7 @@
         <w:pStyle w:val="ListBullet"/>
       </w:pPr>
       <w:r>
-        <w:t>Phase 2: Build &amp; Test by Cloud, Data, DevOps, and QA Engineers with automated scripts</w:t>
+        <w:t>Phase 2 (Weeks 3‑4): Design provider‑agnostic solution, execute a zero‑downtime pilot for 10% of users</w:t>
       </w:r>
     </w:p>
     <w:p>
@@ -175,7 +175,7 @@
         <w:pStyle w:val="ListBullet"/>
       </w:pPr>
       <w:r>
-        <w:t>Phase 3: Blue‑green cutover, 48‑hour hyper‑care, and user communication</w:t>
+        <w:t>Phase 3 (Weeks 5‑6): Perform incremental sync, execute zero‑downtime cut‑over, and complete validation</w:t>
       </w:r>
     </w:p>
     <w:p>
@@ -183,7 +183,7 @@
         <w:pStyle w:val="ListBullet"/>
       </w:pPr>
       <w:r>
-        <w:t>Budget capped at $50 k, leveraging open‑source tools and a $10 k contingency</w:t>
+        <w:t>Budget and resources are scoped to stay within $75‑$100 k, leveraging internal staff and limited consulting</w:t>
       </w:r>
     </w:p>
     <w:p>
@@ -191,7 +191,7 @@
         <w:pStyle w:val="ListBullet"/>
       </w:pPr>
       <w:r>
-        <w:t>Roles ownership clearly assigned to ensure accountability and on‑time delivery</w:t>
+        <w:t>Next step: Obtain confirmation of user count, CRM platform details, and preferred cloud provider to finalize sizing and scheduling</w:t>
       </w:r>
     </w:p>
     <w:p>
@@ -199,12 +199,7 @@
         <w:pStyle w:val="Heading1"/>
       </w:pPr>
       <w:r>
-        <w:t>Scope</w:t>
-      </w:r>
-    </w:p>
-    <w:p>
-      <w:r>
-        <w:t>The migration scope encompasses all components required for the CRM to operate in the target cloud environment while excluding ancillary systems that are not part of the core CRM functionality.</w:t>
+        <w:t>Project Scope</w:t>
       </w:r>
     </w:p>
     <w:p>
@@ -212,7 +207,7 @@
         <w:pStyle w:val="ListBullet"/>
       </w:pPr>
       <w:r>
-        <w:t>CRM application code and configuration (Microsoft Dynamics or equivalent)</w:t>
+        <w:t>In‑Scope Items</w:t>
       </w:r>
     </w:p>
     <w:p>
@@ -220,7 +215,7 @@
         <w:pStyle w:val="ListBullet"/>
       </w:pPr>
       <w:r>
-        <w:t>Primary relational database (SQL‑based, ~200 GB) including schema, stored procedures, and indexes</w:t>
+        <w:t>CRM data (all records, attachments, and audit logs)</w:t>
       </w:r>
     </w:p>
     <w:p>
@@ -228,7 +223,7 @@
         <w:pStyle w:val="ListBullet"/>
       </w:pPr>
       <w:r>
-        <w:t>User‑generated attachments and document storage linked to CRM records</w:t>
+        <w:t>System configurations (entity schemas, security roles, workflow rules)</w:t>
       </w:r>
     </w:p>
     <w:p>
@@ -236,12 +231,7 @@
         <w:pStyle w:val="ListBullet"/>
       </w:pPr>
       <w:r>
-        <w:t>Supporting middleware scripts required for real‑time data replication during blue‑green cutover</w:t>
-      </w:r>
-    </w:p>
-    <w:p>
-      <w:r>
-        <w:t>Target cloud platform: Amazon Web Services (AWS) – the architecture will be defined in a provider‑agnostic manner to allow future migration to other clouds if needed.</w:t>
+        <w:t>Existing integrations (API endpoints, webhooks, third‑party connectors) – to be catalogued and re‑implemented post‑migration</w:t>
       </w:r>
     </w:p>
     <w:p>
@@ -249,7 +239,135 @@
         <w:pStyle w:val="ListBullet"/>
       </w:pPr>
       <w:r>
-        <w:t>Exclusions: Legacy reporting tools that interface with the on‑premise CRM but are not migrated; any non‑CRM enterprise applications (e.g., ERP, HR systems); custom integrations that will be decommissioned or re‑implemented post‑migration; hardware‑specific components such as on‑premise load balancers</w:t>
+        <w:t>User access and permissions (including group memberships and SSO settings)</w:t>
+      </w:r>
+    </w:p>
+    <w:p>
+      <w:pPr>
+        <w:pStyle w:val="ListBullet"/>
+      </w:pPr>
+      <w:r>
+        <w:t>Incremental data replication setup for zero‑downtime cut‑over</w:t>
+      </w:r>
+    </w:p>
+    <w:p>
+      <w:pPr>
+        <w:pStyle w:val="ListBullet"/>
+      </w:pPr>
+      <w:r>
+        <w:t>Out‑of‑Scope Items</w:t>
+      </w:r>
+    </w:p>
+    <w:p>
+      <w:pPr>
+        <w:pStyle w:val="ListBullet"/>
+      </w:pPr>
+      <w:r>
+        <w:t>Major custom code rewrites or redevelopment of bespoke modules</w:t>
+      </w:r>
+    </w:p>
+    <w:p>
+      <w:pPr>
+        <w:pStyle w:val="ListBullet"/>
+      </w:pPr>
+      <w:r>
+        <w:t>Replacement of core CRM platform (migration assumes functional parity with current on‑prem solution)</w:t>
+      </w:r>
+    </w:p>
+    <w:p>
+      <w:pPr>
+        <w:pStyle w:val="ListBullet"/>
+      </w:pPr>
+      <w:r>
+        <w:t>Long‑term post‑migration support beyond the 2‑week hyper‑care window</w:t>
+      </w:r>
+    </w:p>
+    <w:p>
+      <w:pPr>
+        <w:pStyle w:val="ListBullet"/>
+      </w:pPr>
+      <w:r>
+        <w:t>Deliverables</w:t>
+      </w:r>
+    </w:p>
+    <w:p>
+      <w:pPr>
+        <w:pStyle w:val="ListBullet"/>
+      </w:pPr>
+      <w:r>
+        <w:t>Detailed Migration Plan (including discovery findings, architecture diagrams, and pilot results)</w:t>
+      </w:r>
+    </w:p>
+    <w:p>
+      <w:pPr>
+        <w:pStyle w:val="ListBullet"/>
+      </w:pPr>
+      <w:r>
+        <w:t>Test Results Report (functional, performance, and security testing outcomes)</w:t>
+      </w:r>
+    </w:p>
+    <w:p>
+      <w:pPr>
+        <w:pStyle w:val="ListBullet"/>
+      </w:pPr>
+      <w:r>
+        <w:t>Cut‑over Checklist (step‑by‑step zero‑downtime switch, rollback procedures, and sign‑off criteria)</w:t>
+      </w:r>
+    </w:p>
+    <w:p>
+      <w:pPr>
+        <w:pStyle w:val="ListBullet"/>
+      </w:pPr>
+      <w:r>
+        <w:t>Migration Run‑books for Cloud Engineer and DevOps Engineer</w:t>
+      </w:r>
+    </w:p>
+    <w:p>
+      <w:pPr>
+        <w:pStyle w:val="ListBullet"/>
+      </w:pPr>
+      <w:r>
+        <w:t>Success Criteria</w:t>
+      </w:r>
+    </w:p>
+    <w:p>
+      <w:pPr>
+        <w:pStyle w:val="ListBullet"/>
+      </w:pPr>
+      <w:r>
+        <w:t>Zero downtime experienced by end‑users during the final cut‑over</w:t>
+      </w:r>
+    </w:p>
+    <w:p>
+      <w:pPr>
+        <w:pStyle w:val="ListBullet"/>
+      </w:pPr>
+      <w:r>
+        <w:t>Post‑migration performance equal to or better than baseline on‑prem metrics (response time &lt; 2 seconds for 95 % of transactions)</w:t>
+      </w:r>
+    </w:p>
+    <w:p>
+      <w:pPr>
+        <w:pStyle w:val="ListBullet"/>
+      </w:pPr>
+      <w:r>
+        <w:t>User Acceptance Testing sign‑off from at least 90 % of sampled users</w:t>
+      </w:r>
+    </w:p>
+    <w:p>
+      <w:pPr>
+        <w:pStyle w:val="ListBullet"/>
+      </w:pPr>
+      <w:r>
+        <w:t>All integrations functional with no data loss</w:t>
+      </w:r>
+    </w:p>
+    <w:p>
+      <w:pPr>
+        <w:pStyle w:val="ListBullet"/>
+      </w:pPr>
+      <w:r>
+        <w:t>Project completed within 6 weeks and total cost within the $75,000–$100,000 budget</w:t>
       </w:r>
     </w:p>
     <w:p>
@@ -257,54 +375,12 @@
         <w:pStyle w:val="Heading1"/>
       </w:pPr>
       <w:r>
-        <w:t>Approach &amp; Methodology</w:t>
+        <w:t>Timeline &amp; Milestones</w:t>
       </w:r>
     </w:p>
     <w:p>
       <w:r>
-        <w:t>The migration will follow a blue‑green pattern that enables a parallel production‑grade environment in AWS while the on‑premise CRM remains live. A real‑time data replication service (e.g., AWS Database Migration Service) will continuously sync the on‑premise SQL database to the cloud replica, ensuring that any transaction occurring during the build phase is captured. The replication topology is configured as one‑way (on‑premise → cloud) with change data capture enabled, and a fallback switch is retained until the final cutover validation is complete.</w:t>
-      </w:r>
-    </w:p>
-    <w:p>
-      <w:pPr>
-        <w:pStyle w:val="ListBullet"/>
-      </w:pPr>
-      <w:r>
-        <w:t>Phase 1 (Weeks 1‑2 – Discovery &amp; Planning): Business Analyst gathers user‑access patterns and data‑retention requirements; Solution Architect designs the target AWS architecture, including VPC, subnets, security groups, and the blue‑green deployment topology; Project Manager finalises the detailed schedule and risk log.</w:t>
-      </w:r>
-    </w:p>
-    <w:p>
-      <w:pPr>
-        <w:pStyle w:val="ListBullet"/>
-      </w:pPr>
-      <w:r>
-        <w:t>Phase 2 (Weeks 3‑4 – Build &amp; Test): Cloud Engineer provisions the blue environment (identical instance types, storage, and networking); Data Engineer configures DMS tasks to replicate the 200 GB database and attachment store; DevOps Engineer scripts infrastructure‑as‑code (Terraform) and automated fail‑over procedures; QA Engineer executes functional, performance, and zero‑downtime cutover simulations using a staged data set; any issues are logged and remediated before proceeding.</w:t>
-      </w:r>
-    </w:p>
-    <w:p>
-      <w:pPr>
-        <w:pStyle w:val="ListBullet"/>
-      </w:pPr>
-      <w:r>
-        <w:t>Phase 3 (Weeks 5‑6 – Cutover &amp; Hypercare): A coordinated blue‑green switch is performed during a low‑traffic window; DNS and load‑balancer endpoints are updated to point to the green (cloud) environment; real‑time replication is paused, final data delta is applied, and the on‑premise system is de‑commissioned; Support Engineer monitors the system for 48 hours, handling any post‑cutover incidents; Trainer distributes user communication and quick‑start guides.</w:t>
-      </w:r>
-    </w:p>
-    <w:p>
-      <w:r>
-        <w:t>Testing strategy emphasizes zero‑downtime validation: parallel run tests compare response times and data integrity between blue and green instances; automated regression suites are executed against both environments; a rollback drill is performed in Phase 2 to confirm that traffic can be reverted to the blue environment within five minutes, satisfying the acceptance criterion of &lt; 5 min downtime.</w:t>
-      </w:r>
-    </w:p>
-    <w:p>
-      <w:pPr>
-        <w:pStyle w:val="Heading1"/>
-      </w:pPr>
-      <w:r>
-        <w:t>Timeline</w:t>
-      </w:r>
-    </w:p>
-    <w:p>
-      <w:r>
-        <w:t>The following table provides an estimated week‑by‑week schedule for the CRM cloud migration, aligning each activity with the defined phases and responsible roles.</w:t>
+        <w:t>The following timeline outlines the key activities, responsible roles, and deliverables for each week of the six‑week CRM cloud migration.</w:t>
       </w:r>
     </w:p>
     <w:tbl>
@@ -349,7 +425,7 @@
                 <w:b/>
                 <w:color w:val="FFFFFF"/>
               </w:rPr>
-              <w:t>Phase</w:t>
+              <w:t>Activity</w:t>
             </w:r>
           </w:p>
         </w:tc>
@@ -365,7 +441,7 @@
                 <w:b/>
                 <w:color w:val="FFFFFF"/>
               </w:rPr>
-              <w:t>Activities</w:t>
+              <w:t>Owner(s)</w:t>
             </w:r>
           </w:p>
         </w:tc>
@@ -381,7 +457,7 @@
                 <w:b/>
                 <w:color w:val="FFFFFF"/>
               </w:rPr>
-              <w:t>Owner</w:t>
+              <w:t>Milestone/Deliverable</w:t>
             </w:r>
           </w:p>
         </w:tc>
@@ -405,7 +481,7 @@
           <w:p>
             <w:r/>
             <w:r>
-              <w:t>Discovery &amp; Planning</w:t>
+              <w:t>Discovery &amp; Planning: confirm user count, inventory integrations, assess data volume, define migration criteria</w:t>
             </w:r>
           </w:p>
         </w:tc>
@@ -416,11 +492,9 @@
           <w:p>
             <w:r/>
             <w:r>
-              <w:t>Requirements gathering and documentation</w:t>
+              <w:t>Project Manager</w:t>
               <w:br/>
-              <w:t>Define target architecture and cloud services</w:t>
-              <w:br/>
-              <w:t>Create detailed migration plan and risk log</w:t>
+              <w:t>Business Analyst</w:t>
             </w:r>
           </w:p>
         </w:tc>
@@ -431,11 +505,7 @@
           <w:p>
             <w:r/>
             <w:r>
-              <w:t>Business Analyst</w:t>
-              <w:br/>
-              <w:t>Solution Architect</w:t>
-              <w:br/>
-              <w:t>Project Manager</w:t>
+              <w:t>User count validated, integration inventory documented, migration charter approved</w:t>
             </w:r>
           </w:p>
         </w:tc>
@@ -461,7 +531,7 @@
           <w:p>
             <w:r/>
             <w:r>
-              <w:t>Build &amp; Test</w:t>
+              <w:t>Architecture Design &amp; Pilot Migration: create provider‑agnostic architecture, set up dual‑write replication, execute pilot for 10% of users</w:t>
             </w:r>
           </w:p>
         </w:tc>
@@ -473,15 +543,9 @@
           <w:p>
             <w:r/>
             <w:r>
-              <w:t>Provision AWS environment and networking</w:t>
+              <w:t>Solution Architect</w:t>
               <w:br/>
-              <w:t>Set up data replication pipeline (real‑time sync)</w:t>
-              <w:br/>
-              <w:t>Migrate a full data replica for testing</w:t>
-              <w:br/>
-              <w:t>Execute functional and performance tests</w:t>
-              <w:br/>
-              <w:t>Validate zero‑downtime cutover process</w:t>
+              <w:t>Cloud Engineer</w:t>
             </w:r>
           </w:p>
         </w:tc>
@@ -493,13 +557,7 @@
           <w:p>
             <w:r/>
             <w:r>
-              <w:t>Cloud Engineer</w:t>
-              <w:br/>
-              <w:t>Data Engineer</w:t>
-              <w:br/>
-              <w:t>QA Engineer</w:t>
-              <w:br/>
-              <w:t>DevOps Engineer</w:t>
+              <w:t>Architecture blueprint completed, pilot environment operational, pilot validation report with zero‑downtime confirmation</w:t>
             </w:r>
           </w:p>
         </w:tc>
@@ -512,7 +570,7 @@
           <w:p>
             <w:r/>
             <w:r>
-              <w:t>Week 5-6</w:t>
+              <w:t>Week 5</w:t>
             </w:r>
           </w:p>
         </w:tc>
@@ -523,7 +581,7 @@
           <w:p>
             <w:r/>
             <w:r>
-              <w:t>Cutover &amp; Hypercare</w:t>
+              <w:t>Incremental Data Sync &amp; Cut‑over Preparation: enable continuous data replication, perform performance testing, finalize cut‑over checklist</w:t>
             </w:r>
           </w:p>
         </w:tc>
@@ -534,15 +592,9 @@
           <w:p>
             <w:r/>
             <w:r>
-              <w:t>Perform blue‑green cutover with live traffic switch</w:t>
+              <w:t>DevOps Engineer</w:t>
               <w:br/>
-              <w:t>Monitor replication lag and system health</w:t>
-              <w:br/>
-              <w:t>Provide 48‑hour hypercare support</w:t>
-              <w:br/>
-              <w:t>Communicate cutover completion and post‑migration guidance</w:t>
-              <w:br/>
-              <w:t>Conduct final acceptance testing and sign‑off</w:t>
+              <w:t>Data Engineer</w:t>
             </w:r>
           </w:p>
         </w:tc>
@@ -553,7 +605,59 @@
           <w:p>
             <w:r/>
             <w:r>
-              <w:t>Support Engineer\nTrainer\nProject Manager</w:t>
+              <w:t>Incremental sync latency &lt; 5 seconds, cut‑over checklist signed off</w:t>
+            </w:r>
+          </w:p>
+        </w:tc>
+      </w:tr>
+      <w:tr>
+        <w:tc>
+          <w:tcPr>
+            <w:tcW w:type="dxa" w:w="2160"/>
+            <w:shd w:val="clear" w:color="auto" w:fill="EEF2F7"/>
+          </w:tcPr>
+          <w:p>
+            <w:r/>
+            <w:r>
+              <w:t>Week 6</w:t>
+            </w:r>
+          </w:p>
+        </w:tc>
+        <w:tc>
+          <w:tcPr>
+            <w:tcW w:type="dxa" w:w="2160"/>
+            <w:shd w:val="clear" w:color="auto" w:fill="EEF2F7"/>
+          </w:tcPr>
+          <w:p>
+            <w:r/>
+            <w:r>
+              <w:t>Full Cut‑over &amp; Validation: switch production traffic to cloud instance, conduct functional and performance testing, obtain user acceptance</w:t>
+            </w:r>
+          </w:p>
+        </w:tc>
+        <w:tc>
+          <w:tcPr>
+            <w:tcW w:type="dxa" w:w="2160"/>
+            <w:shd w:val="clear" w:color="auto" w:fill="EEF2F7"/>
+          </w:tcPr>
+          <w:p>
+            <w:r/>
+            <w:r>
+              <w:t>DevOps Engineer</w:t>
+              <w:br/>
+              <w:t>QA Engineer</w:t>
+            </w:r>
+          </w:p>
+        </w:tc>
+        <w:tc>
+          <w:tcPr>
+            <w:tcW w:type="dxa" w:w="2160"/>
+            <w:shd w:val="clear" w:color="auto" w:fill="EEF2F7"/>
+          </w:tcPr>
+          <w:p>
+            <w:r/>
+            <w:r>
+              <w:t>Zero‑downtime cut‑over executed, validation sign‑off, migration closure report</w:t>
             </w:r>
           </w:p>
         </w:tc>
@@ -565,12 +669,12 @@
         <w:pStyle w:val="Heading1"/>
       </w:pPr>
       <w:r>
-        <w:t>Cost Estimate</w:t>
+        <w:t>Resource &amp; Cost Estimate</w:t>
       </w:r>
     </w:p>
     <w:p>
       <w:r>
-        <w:t>Estimated delivery cost: USD 36,455 (48 person-days, including 15% contingency).</w:t>
+        <w:t>Estimated delivery cost: USD 48,530 (labour USD 33,400 for 49 person-days, non-labour USD 8,800, plus 15% contingency).</w:t>
       </w:r>
     </w:p>
     <w:tbl>
@@ -600,7 +704,7 @@
                 <w:b/>
                 <w:color w:val="FFFFFF"/>
               </w:rPr>
-              <w:t>Role</w:t>
+              <w:t>Item</w:t>
             </w:r>
           </w:p>
         </w:tc>
@@ -632,7 +736,7 @@
                 <w:b/>
                 <w:color w:val="FFFFFF"/>
               </w:rPr>
-              <w:t>Effort (days)</w:t>
+              <w:t>Quantity</w:t>
             </w:r>
           </w:p>
         </w:tc>
@@ -648,7 +752,7 @@
                 <w:b/>
                 <w:color w:val="FFFFFF"/>
               </w:rPr>
-              <w:t>Day rate</w:t>
+              <w:t>Unit rate</w:t>
             </w:r>
           </w:p>
         </w:tc>
@@ -688,7 +792,7 @@
           <w:p>
             <w:r/>
             <w:r>
-              <w:t>Overall schedule, coordination, status reporting</w:t>
+              <w:t>Overall coordination, schedule tracking, stakeholder communication</w:t>
             </w:r>
           </w:p>
         </w:tc>
@@ -699,7 +803,7 @@
           <w:p>
             <w:r/>
             <w:r>
-              <w:t>6</w:t>
+              <w:t>12 days</w:t>
             </w:r>
           </w:p>
         </w:tc>
@@ -721,7 +825,7 @@
           <w:p>
             <w:r/>
             <w:r>
-              <w:t>USD 3,600</w:t>
+              <w:t>USD 7,200</w:t>
             </w:r>
           </w:p>
         </w:tc>
@@ -735,7 +839,7 @@
           <w:p>
             <w:r/>
             <w:r>
-              <w:t>Solution Architect</w:t>
+              <w:t>Business Analyst</w:t>
             </w:r>
           </w:p>
         </w:tc>
@@ -747,7 +851,7 @@
           <w:p>
             <w:r/>
             <w:r>
-              <w:t>Design target cloud architecture and migration pattern</w:t>
+              <w:t>Discovery, user count validation, integration inventory</w:t>
             </w:r>
           </w:p>
         </w:tc>
@@ -759,7 +863,7 @@
           <w:p>
             <w:r/>
             <w:r>
-              <w:t>5</w:t>
+              <w:t>8 days</w:t>
             </w:r>
           </w:p>
         </w:tc>
@@ -771,7 +875,7 @@
           <w:p>
             <w:r/>
             <w:r>
-              <w:t>USD 900</w:t>
+              <w:t>USD 550</w:t>
             </w:r>
           </w:p>
         </w:tc>
@@ -783,7 +887,7 @@
           <w:p>
             <w:r/>
             <w:r>
-              <w:t>USD 4,500</w:t>
+              <w:t>USD 4,400</w:t>
             </w:r>
           </w:p>
         </w:tc>
@@ -796,7 +900,7 @@
           <w:p>
             <w:r/>
             <w:r>
-              <w:t>Cloud Engineer</w:t>
+              <w:t>Solution Architect</w:t>
             </w:r>
           </w:p>
         </w:tc>
@@ -807,7 +911,7 @@
           <w:p>
             <w:r/>
             <w:r>
-              <w:t>Provision AWS environment, networking, security groups</w:t>
+              <w:t>Design provider‑agnostic architecture, pilot plan</w:t>
             </w:r>
           </w:p>
         </w:tc>
@@ -818,7 +922,126 @@
           <w:p>
             <w:r/>
             <w:r>
-              <w:t>8</w:t>
+              <w:t>6 days</w:t>
+            </w:r>
+          </w:p>
+        </w:tc>
+        <w:tc>
+          <w:tcPr>
+            <w:tcW w:type="dxa" w:w="1728"/>
+          </w:tcPr>
+          <w:p>
+            <w:r/>
+            <w:r>
+              <w:t>USD 900</w:t>
+            </w:r>
+          </w:p>
+        </w:tc>
+        <w:tc>
+          <w:tcPr>
+            <w:tcW w:type="dxa" w:w="1728"/>
+          </w:tcPr>
+          <w:p>
+            <w:r/>
+            <w:r>
+              <w:t>USD 5,400</w:t>
+            </w:r>
+          </w:p>
+        </w:tc>
+      </w:tr>
+      <w:tr>
+        <w:tc>
+          <w:tcPr>
+            <w:tcW w:type="dxa" w:w="1728"/>
+            <w:shd w:val="clear" w:color="auto" w:fill="EEF2F7"/>
+          </w:tcPr>
+          <w:p>
+            <w:r/>
+            <w:r>
+              <w:t>Cloud Engineer</w:t>
+            </w:r>
+          </w:p>
+        </w:tc>
+        <w:tc>
+          <w:tcPr>
+            <w:tcW w:type="dxa" w:w="1728"/>
+            <w:shd w:val="clear" w:color="auto" w:fill="EEF2F7"/>
+          </w:tcPr>
+          <w:p>
+            <w:r/>
+            <w:r>
+              <w:t>Provision cloud resources, execute pilot migration</w:t>
+            </w:r>
+          </w:p>
+        </w:tc>
+        <w:tc>
+          <w:tcPr>
+            <w:tcW w:type="dxa" w:w="1728"/>
+            <w:shd w:val="clear" w:color="auto" w:fill="EEF2F7"/>
+          </w:tcPr>
+          <w:p>
+            <w:r/>
+            <w:r>
+              <w:t>8 days</w:t>
+            </w:r>
+          </w:p>
+        </w:tc>
+        <w:tc>
+          <w:tcPr>
+            <w:tcW w:type="dxa" w:w="1728"/>
+            <w:shd w:val="clear" w:color="auto" w:fill="EEF2F7"/>
+          </w:tcPr>
+          <w:p>
+            <w:r/>
+            <w:r>
+              <w:t>USD 750</w:t>
+            </w:r>
+          </w:p>
+        </w:tc>
+        <w:tc>
+          <w:tcPr>
+            <w:tcW w:type="dxa" w:w="1728"/>
+            <w:shd w:val="clear" w:color="auto" w:fill="EEF2F7"/>
+          </w:tcPr>
+          <w:p>
+            <w:r/>
+            <w:r>
+              <w:t>USD 6,000</w:t>
+            </w:r>
+          </w:p>
+        </w:tc>
+      </w:tr>
+      <w:tr>
+        <w:tc>
+          <w:tcPr>
+            <w:tcW w:type="dxa" w:w="1728"/>
+          </w:tcPr>
+          <w:p>
+            <w:r/>
+            <w:r>
+              <w:t>DevOps Engineer</w:t>
+            </w:r>
+          </w:p>
+        </w:tc>
+        <w:tc>
+          <w:tcPr>
+            <w:tcW w:type="dxa" w:w="1728"/>
+          </w:tcPr>
+          <w:p>
+            <w:r/>
+            <w:r>
+              <w:t>Implement dual‑write replication, cut‑over automation</w:t>
+            </w:r>
+          </w:p>
+        </w:tc>
+        <w:tc>
+          <w:tcPr>
+            <w:tcW w:type="dxa" w:w="1728"/>
+          </w:tcPr>
+          <w:p>
+            <w:r/>
+            <w:r>
+              <w:t>6 days</w:t>
             </w:r>
           </w:p>
         </w:tc>
@@ -840,7 +1063,7 @@
           <w:p>
             <w:r/>
             <w:r>
-              <w:t>USD 6,000</w:t>
+              <w:t>USD 4,500</w:t>
             </w:r>
           </w:p>
         </w:tc>
@@ -854,7 +1077,7 @@
           <w:p>
             <w:r/>
             <w:r>
-              <w:t>Data Engineer</w:t>
+              <w:t>QA Engineer</w:t>
             </w:r>
           </w:p>
         </w:tc>
@@ -866,7 +1089,7 @@
           <w:p>
             <w:r/>
             <w:r>
-              <w:t>Set up replication, migrate 200 GB data, validate integrity</w:t>
+              <w:t>Validate data integrity, performance, zero‑downtime testing</w:t>
             </w:r>
           </w:p>
         </w:tc>
@@ -878,7 +1101,7 @@
           <w:p>
             <w:r/>
             <w:r>
-              <w:t>8</w:t>
+              <w:t>5 days</w:t>
             </w:r>
           </w:p>
         </w:tc>
@@ -890,7 +1113,7 @@
           <w:p>
             <w:r/>
             <w:r>
-              <w:t>USD 700</w:t>
+              <w:t>USD 500</w:t>
             </w:r>
           </w:p>
         </w:tc>
@@ -902,7 +1125,7 @@
           <w:p>
             <w:r/>
             <w:r>
-              <w:t>USD 5,600</w:t>
+              <w:t>USD 2,500</w:t>
             </w:r>
           </w:p>
         </w:tc>
@@ -915,7 +1138,7 @@
           <w:p>
             <w:r/>
             <w:r>
-              <w:t>QA Engineer</w:t>
+              <w:t>Security Specialist</w:t>
             </w:r>
           </w:p>
         </w:tc>
@@ -926,7 +1149,7 @@
           <w:p>
             <w:r/>
             <w:r>
-              <w:t>Test zero‑downtime cutover, performance and data validation</w:t>
+              <w:t>Review GDPR controls, secure data transfer design</w:t>
             </w:r>
           </w:p>
         </w:tc>
@@ -937,7 +1160,7 @@
           <w:p>
             <w:r/>
             <w:r>
-              <w:t>5</w:t>
+              <w:t>4 days</w:t>
             </w:r>
           </w:p>
         </w:tc>
@@ -948,7 +1171,126 @@
           <w:p>
             <w:r/>
             <w:r>
-              <w:t>USD 500</w:t>
+              <w:t>USD 850</w:t>
+            </w:r>
+          </w:p>
+        </w:tc>
+        <w:tc>
+          <w:tcPr>
+            <w:tcW w:type="dxa" w:w="1728"/>
+          </w:tcPr>
+          <w:p>
+            <w:r/>
+            <w:r>
+              <w:t>USD 3,400</w:t>
+            </w:r>
+          </w:p>
+        </w:tc>
+      </w:tr>
+      <w:tr>
+        <w:tc>
+          <w:tcPr>
+            <w:tcW w:type="dxa" w:w="1728"/>
+            <w:shd w:val="clear" w:color="auto" w:fill="EEF2F7"/>
+          </w:tcPr>
+          <w:p>
+            <w:r/>
+            <w:r>
+              <w:t>Migration tooling licence (per month)</w:t>
+            </w:r>
+          </w:p>
+        </w:tc>
+        <w:tc>
+          <w:tcPr>
+            <w:tcW w:type="dxa" w:w="1728"/>
+            <w:shd w:val="clear" w:color="auto" w:fill="EEF2F7"/>
+          </w:tcPr>
+          <w:p>
+            <w:r/>
+            <w:r>
+              <w:t>Non-labour</w:t>
+            </w:r>
+          </w:p>
+        </w:tc>
+        <w:tc>
+          <w:tcPr>
+            <w:tcW w:type="dxa" w:w="1728"/>
+            <w:shd w:val="clear" w:color="auto" w:fill="EEF2F7"/>
+          </w:tcPr>
+          <w:p>
+            <w:r/>
+            <w:r>
+              <w:t>x 1</w:t>
+            </w:r>
+          </w:p>
+        </w:tc>
+        <w:tc>
+          <w:tcPr>
+            <w:tcW w:type="dxa" w:w="1728"/>
+            <w:shd w:val="clear" w:color="auto" w:fill="EEF2F7"/>
+          </w:tcPr>
+          <w:p>
+            <w:r/>
+            <w:r>
+              <w:t>USD 1,500</w:t>
+            </w:r>
+          </w:p>
+        </w:tc>
+        <w:tc>
+          <w:tcPr>
+            <w:tcW w:type="dxa" w:w="1728"/>
+            <w:shd w:val="clear" w:color="auto" w:fill="EEF2F7"/>
+          </w:tcPr>
+          <w:p>
+            <w:r/>
+            <w:r>
+              <w:t>USD 1,500</w:t>
+            </w:r>
+          </w:p>
+        </w:tc>
+      </w:tr>
+      <w:tr>
+        <w:tc>
+          <w:tcPr>
+            <w:tcW w:type="dxa" w:w="1728"/>
+          </w:tcPr>
+          <w:p>
+            <w:r/>
+            <w:r>
+              <w:t>Cloud infrastructure during parallel run (per month)</w:t>
+            </w:r>
+          </w:p>
+        </w:tc>
+        <w:tc>
+          <w:tcPr>
+            <w:tcW w:type="dxa" w:w="1728"/>
+          </w:tcPr>
+          <w:p>
+            <w:r/>
+            <w:r>
+              <w:t>Non-labour</w:t>
+            </w:r>
+          </w:p>
+        </w:tc>
+        <w:tc>
+          <w:tcPr>
+            <w:tcW w:type="dxa" w:w="1728"/>
+          </w:tcPr>
+          <w:p>
+            <w:r/>
+            <w:r>
+              <w:t>x 1</w:t>
+            </w:r>
+          </w:p>
+        </w:tc>
+        <w:tc>
+          <w:tcPr>
+            <w:tcW w:type="dxa" w:w="1728"/>
+          </w:tcPr>
+          <w:p>
+            <w:r/>
+            <w:r>
+              <w:t>USD 2,500</w:t>
             </w:r>
           </w:p>
         </w:tc>
@@ -973,7 +1315,7 @@
           <w:p>
             <w:r/>
             <w:r>
-              <w:t>DevOps Engineer</w:t>
+              <w:t>Temporary network bandwidth upgrade (per month)</w:t>
             </w:r>
           </w:p>
         </w:tc>
@@ -985,7 +1327,7 @@
           <w:p>
             <w:r/>
             <w:r>
-              <w:t>Automate infrastructure as code and migration scripts</w:t>
+              <w:t>Non-labour</w:t>
             </w:r>
           </w:p>
         </w:tc>
@@ -997,7 +1339,7 @@
           <w:p>
             <w:r/>
             <w:r>
-              <w:t>5</w:t>
+              <w:t>x 1</w:t>
             </w:r>
           </w:p>
         </w:tc>
@@ -1009,7 +1351,7 @@
           <w:p>
             <w:r/>
             <w:r>
-              <w:t>USD 750</w:t>
+              <w:t>USD 800</w:t>
             </w:r>
           </w:p>
         </w:tc>
@@ -1021,7 +1363,7 @@
           <w:p>
             <w:r/>
             <w:r>
-              <w:t>USD 3,750</w:t>
+              <w:t>USD 800</w:t>
             </w:r>
           </w:p>
         </w:tc>
@@ -1034,7 +1376,7 @@
           <w:p>
             <w:r/>
             <w:r>
-              <w:t>Support Engineer</w:t>
+              <w:t>External security review (fixed)</w:t>
             </w:r>
           </w:p>
         </w:tc>
@@ -1045,7 +1387,7 @@
           <w:p>
             <w:r/>
             <w:r>
-              <w:t>48‑hour hyper‑care post‑cutover and issue triage</w:t>
+              <w:t>Non-labour</w:t>
             </w:r>
           </w:p>
         </w:tc>
@@ -1056,7 +1398,7 @@
           <w:p>
             <w:r/>
             <w:r>
-              <w:t>4</w:t>
+              <w:t>x 1</w:t>
             </w:r>
           </w:p>
         </w:tc>
@@ -1067,7 +1409,7 @@
           <w:p>
             <w:r/>
             <w:r>
-              <w:t>USD 400</w:t>
+              <w:t>USD 4,000</w:t>
             </w:r>
           </w:p>
         </w:tc>
@@ -1078,126 +1420,7 @@
           <w:p>
             <w:r/>
             <w:r>
-              <w:t>USD 1,600</w:t>
-            </w:r>
-          </w:p>
-        </w:tc>
-      </w:tr>
-      <w:tr>
-        <w:tc>
-          <w:tcPr>
-            <w:tcW w:type="dxa" w:w="1728"/>
-            <w:shd w:val="clear" w:color="auto" w:fill="EEF2F7"/>
-          </w:tcPr>
-          <w:p>
-            <w:r/>
-            <w:r>
-              <w:t>Trainer</w:t>
-            </w:r>
-          </w:p>
-        </w:tc>
-        <w:tc>
-          <w:tcPr>
-            <w:tcW w:type="dxa" w:w="1728"/>
-            <w:shd w:val="clear" w:color="auto" w:fill="EEF2F7"/>
-          </w:tcPr>
-          <w:p>
-            <w:r/>
-            <w:r>
-              <w:t>Prepare user communication and quick‑start guides</w:t>
-            </w:r>
-          </w:p>
-        </w:tc>
-        <w:tc>
-          <w:tcPr>
-            <w:tcW w:type="dxa" w:w="1728"/>
-            <w:shd w:val="clear" w:color="auto" w:fill="EEF2F7"/>
-          </w:tcPr>
-          <w:p>
-            <w:r/>
-            <w:r>
-              <w:t>2</w:t>
-            </w:r>
-          </w:p>
-        </w:tc>
-        <w:tc>
-          <w:tcPr>
-            <w:tcW w:type="dxa" w:w="1728"/>
-            <w:shd w:val="clear" w:color="auto" w:fill="EEF2F7"/>
-          </w:tcPr>
-          <w:p>
-            <w:r/>
-            <w:r>
-              <w:t>USD 450</w:t>
-            </w:r>
-          </w:p>
-        </w:tc>
-        <w:tc>
-          <w:tcPr>
-            <w:tcW w:type="dxa" w:w="1728"/>
-            <w:shd w:val="clear" w:color="auto" w:fill="EEF2F7"/>
-          </w:tcPr>
-          <w:p>
-            <w:r/>
-            <w:r>
-              <w:t>USD 900</w:t>
-            </w:r>
-          </w:p>
-        </w:tc>
-      </w:tr>
-      <w:tr>
-        <w:tc>
-          <w:tcPr>
-            <w:tcW w:type="dxa" w:w="1728"/>
-          </w:tcPr>
-          <w:p>
-            <w:r/>
-            <w:r>
-              <w:t>Software Engineer</w:t>
-            </w:r>
-          </w:p>
-        </w:tc>
-        <w:tc>
-          <w:tcPr>
-            <w:tcW w:type="dxa" w:w="1728"/>
-          </w:tcPr>
-          <w:p>
-            <w:r/>
-            <w:r>
-              <w:t>External vendor support for migration tool licensing and custom adapters</w:t>
-            </w:r>
-          </w:p>
-        </w:tc>
-        <w:tc>
-          <w:tcPr>
-            <w:tcW w:type="dxa" w:w="1728"/>
-          </w:tcPr>
-          <w:p>
-            <w:r/>
-            <w:r>
-              <w:t>5</w:t>
-            </w:r>
-          </w:p>
-        </w:tc>
-        <w:tc>
-          <w:tcPr>
-            <w:tcW w:type="dxa" w:w="1728"/>
-          </w:tcPr>
-          <w:p>
-            <w:r/>
-            <w:r>
-              <w:t>USD 650</w:t>
-            </w:r>
-          </w:p>
-        </w:tc>
-        <w:tc>
-          <w:tcPr>
-            <w:tcW w:type="dxa" w:w="1728"/>
-          </w:tcPr>
-          <w:p>
-            <w:r/>
-            <w:r>
-              <w:t>USD 3,250</w:t>
+              <w:t>USD 4,000</w:t>
             </w:r>
           </w:p>
         </w:tc>
@@ -1232,7 +1455,7 @@
           <w:p>
             <w:r/>
             <w:r>
-              <w:t>48</w:t>
+              <w:t>49 days</w:t>
             </w:r>
           </w:p>
         </w:tc>
@@ -1253,7 +1476,7 @@
           <w:p>
             <w:r/>
             <w:r>
-              <w:t>USD 31,700</w:t>
+              <w:t>USD 42,200</w:t>
             </w:r>
           </w:p>
         </w:tc>
@@ -1301,7 +1524,7 @@
           <w:p>
             <w:r/>
             <w:r>
-              <w:t>USD 4,755</w:t>
+              <w:t>USD 6,330</w:t>
             </w:r>
           </w:p>
         </w:tc>
@@ -1360,7 +1583,7 @@
               <w:rPr>
                 <w:b/>
               </w:rPr>
-              <w:t>USD 36,455</w:t>
+              <w:t>USD 48,530</w:t>
             </w:r>
           </w:p>
         </w:tc>
@@ -1369,7 +1592,7 @@
     <w:p/>
     <w:p>
       <w:r>
-        <w:t>Effort figures are estimates; rates come from the reference rate card (illustrative data) and all totals are calculated, not generated. Basis: Assumes 8‑hour work days; total labor cost ≈ $48,480 plus $1,520 (10% contingency) = $50,000 budget cap. Effort is spread over the 6‑week timeline, respecting the tight budget and zero‑downtime requirement.</w:t>
+        <w:t>Effort figures are estimates; rates come from the reference rate card (illustrative data) and all totals are calculated, not generated. Basis: Assumes 150‑250 users, 5 TB data, and that each role can work up to 30 days within the 6‑week window; non‑labour items cover the one‑month parallel run period.</w:t>
       </w:r>
     </w:p>
     <w:p>
@@ -1377,7 +1600,12 @@
         <w:pStyle w:val="Heading1"/>
       </w:pPr>
       <w:r>
-        <w:t>Risks &amp; Mitigations</w:t>
+        <w:t>Migration Approach</w:t>
+      </w:r>
+    </w:p>
+    <w:p>
+      <w:r>
+        <w:t>The migration will use a provider‑agnostic architecture that can be instantiated on AWS, Azure, or GCP with comparable services (e.g., managed relational database, virtual network, and identity federation). The core design consists of a cloud‑hosted replica of the on‑prem CRM database, a dual‑write synchronization layer using Change Data Capture (CDC), and a load‑balancer that can route traffic to either the on‑prem or cloud instance during the cut‑over window.</w:t>
       </w:r>
     </w:p>
     <w:p>
@@ -1385,7 +1613,7 @@
         <w:pStyle w:val="ListBullet"/>
       </w:pPr>
       <w:r>
-        <w:t>Tight budget may restrict acquisition of premium migration tools; mitigation – leverage open‑source replication utilities (e.g., AWS DMS free tier) during Phase 2 and allocate the $10k contingency for only essential vendor licenses, with any shortfall covered by re‑allocating internal engineering hours (Project Manager, Solution Architect, Cloud Engineer).</w:t>
+        <w:t>Architecture Options:</w:t>
       </w:r>
     </w:p>
     <w:p>
@@ -1393,7 +1621,7 @@
         <w:pStyle w:val="ListBullet"/>
       </w:pPr>
       <w:r>
-        <w:t>Zero‑downtime requirement adds architectural complexity; mitigation – adopt the blue‑green migration pattern defined in Phase 3, perform extensive end‑to‑end rehearsal in the Build &amp; Test window (Weeks 3‑4) and use automated fail‑over scripts authored by the DevOps Engineer to ensure cut‑over can be rolled back within minutes if issues arise.</w:t>
+        <w:t>Option A – Managed relational service (Amazon RDS / Azure SQL Database / Cloud SQL) with built‑in high availability; estimated compute cost $2,000‑$3,000 per month.</w:t>
       </w:r>
     </w:p>
     <w:p>
@@ -1401,7 +1629,7 @@
         <w:pStyle w:val="ListBullet"/>
       </w:pPr>
       <w:r>
-        <w:t>Data volume of ~200 GB could extend replication windows and impact network bandwidth; mitigation – schedule initial bulk load during low‑traffic periods in Week 2 (Discovery &amp; Planning) using incremental sync thereafter, and monitor transfer rates with Cloud Engineer‑managed CloudWatch alerts to stay within the 6‑week schedule.</w:t>
+        <w:t>Option B – Containerized CRM on Kubernetes (EKS / AKS / GKE) for greater control over custom extensions; estimated compute cost $3,500‑$4,500 per month.</w:t>
       </w:r>
     </w:p>
     <w:p>
@@ -1409,7 +1637,94 @@
         <w:pStyle w:val="ListBullet"/>
       </w:pPr>
       <w:r>
-        <w:t>User count (150‑250) is uncertain, affecting load‑testing and capacity planning; mitigation – treat the upper bound (250 users) as the baseline for performance testing in Phase 2, and incorporate a scalability buffer in the AWS instance sizing; confirm actual count during the Discovery phase (Week 1) and adjust resources in the hyper‑care window if needed.</w:t>
+        <w:t>Both options include VPC/VNet isolation, VPN/Direct Connect link, and Azure AD / AWS IAM integration for single sign‑on.</w:t>
+      </w:r>
+    </w:p>
+    <w:p>
+      <w:pPr>
+        <w:pStyle w:val="ListBullet"/>
+      </w:pPr>
+      <w:r>
+        <w:t>Data Replication Method:</w:t>
+      </w:r>
+    </w:p>
+    <w:p>
+      <w:pPr>
+        <w:pStyle w:val="ListBullet"/>
+      </w:pPr>
+      <w:r>
+        <w:t>CDC agents on the on‑prem database capture inserts, updates, and deletes in near real‑time.</w:t>
+      </w:r>
+    </w:p>
+    <w:p>
+      <w:pPr>
+        <w:pStyle w:val="ListBullet"/>
+      </w:pPr>
+      <w:r>
+        <w:t>Dual‑write service streams changes to the cloud replica, maintaining data parity with latency &lt;5 seconds.</w:t>
+      </w:r>
+    </w:p>
+    <w:p>
+      <w:pPr>
+        <w:pStyle w:val="ListBullet"/>
+      </w:pPr>
+      <w:r>
+        <w:t>A fallback switch can revert writes to the on‑prem system if anomalies are detected during pilot.</w:t>
+      </w:r>
+    </w:p>
+    <w:p>
+      <w:r>
+        <w:t>Pilot Migration (Phase 2, Weeks 3‑4): The Solution Architect and Cloud Engineer will select a representative subset of 10 % of users (≈15‑25 users) and migrate their data and configurations to the cloud replica. Dual‑write will be enabled for this cohort, and functional testing will verify that all CRM screens, workflows, and integrations operate without interruption. Performance metrics and latency will be logged for comparison against on‑prem baselines.</w:t>
+      </w:r>
+    </w:p>
+    <w:p>
+      <w:r>
+        <w:t>Cut‑over Strategy (Phase 3, Weeks 5‑6): During a pre‑defined low‑usage window (e.g., Saturday 02:00‑04:00 UTC), the DevOps Engineer will pause CDC, perform a final incremental sync, and switch the load‑balancer to direct all user traffic to the cloud instance. Dual‑write will be disabled, making the cloud CRM the single source of truth. A rollback plan retains the on‑prem system for 24 hours as a safety net.</w:t>
+      </w:r>
+    </w:p>
+    <w:p>
+      <w:r>
+        <w:t>Validation Procedures: Post‑cut‑over, the QA Engineer will execute a validation checklist covering data integrity (row counts, checksum comparisons), functional tests (key business processes, integration endpoints), and performance benchmarks (response time &lt;200 ms). User Acceptance Testing will be conducted with a sample of end‑users; any issues will trigger the rollback window. Successful validation is recorded as the final milestone for the migration project.</w:t>
+      </w:r>
+    </w:p>
+    <w:p>
+      <w:pPr>
+        <w:pStyle w:val="Heading1"/>
+      </w:pPr>
+      <w:r>
+        <w:t>Risk Management</w:t>
+      </w:r>
+    </w:p>
+    <w:p>
+      <w:pPr>
+        <w:pStyle w:val="ListBullet"/>
+      </w:pPr>
+      <w:r>
+        <w:t>Risk: Budget overrun; Owner: Project Manager; Mitigation: Strict cost tracking against the $75,000‑$100,000 cap, use provider‑agnostic licensing estimates, limit consulting hours to predefined milestones; Contingency: Re‑prioritize non‑critical tasks (e.g., defer optional post‑migration training) and negotiate volume discounts with the selected cloud provider.</w:t>
+      </w:r>
+    </w:p>
+    <w:p>
+      <w:pPr>
+        <w:pStyle w:val="ListBullet"/>
+      </w:pPr>
+      <w:r>
+        <w:t>Risk: Timeline slip (exceeding 6‑week deadline); Owner: Solution Architect; Mitigation: Detailed weekly sprint plans, buffer tasks in Phase 2 pilot, daily stand‑ups to identify blockers early, use automated deployment pipelines; Contingency: Activate a parallel fast‑track cut‑over window during the lowest usage period and, if needed, extend Phase 3 by one week with executive approval while maintaining zero‑downtime via dual‑write replication.</w:t>
+      </w:r>
+    </w:p>
+    <w:p>
+      <w:pPr>
+        <w:pStyle w:val="ListBullet"/>
+      </w:pPr>
+      <w:r>
+        <w:t>Risk: Data sync issues during incremental replication; Owner: Data Engineer; Mitigation: Implement CDC‑based dual‑write shadow replication, run continuous validation checks, conduct a full data integrity test in the pilot; Contingency: Roll back to on‑premises read‑only mode, pause sync, resolve conflicts, and resume after issue resolution without user impact.</w:t>
+      </w:r>
+    </w:p>
+    <w:p>
+      <w:pPr>
+        <w:pStyle w:val="ListBullet"/>
+      </w:pPr>
+      <w:r>
+        <w:t>Risk: Compliance gaps (GDPR controls); Owner: Security Specialist; Mitigation: Perform a compliance checklist during Phase 1, configure encryption‑at‑rest and in‑transit, enforce role‑based access, and schedule an external audit of the cloud environment; Contingency: If a gap is identified, isolate affected data sets, apply required controls, and, if necessary, postpone migration of those data sets until compliance is achieved.</w:t>
       </w:r>
     </w:p>
     <w:p>
@@ -1489,7 +1804,7 @@
           <w:p>
             <w:r/>
             <w:r>
-              <w:t>Number of CRM users is moderate (approximately 150‑250) and will be confirmed later</w:t>
+              <w:t>User count to be confirmed by requester; assume 150‑250 active users for sizing purposes</w:t>
             </w:r>
           </w:p>
         </w:tc>
@@ -1515,7 +1830,7 @@
           <w:p>
             <w:r/>
             <w:r>
-              <w:t>Current CRM runs on an on‑premise SQL‑based system (e.g., Microsoft Dynamics or similar)</w:t>
+              <w:t>Current CRM is an on‑premises solution (e.g., Microsoft Dynamics or custom app) that can be replicated in the cloud</w:t>
             </w:r>
           </w:p>
         </w:tc>
@@ -1539,7 +1854,7 @@
           <w:p>
             <w:r/>
             <w:r>
-              <w:t>Target cloud provider will be AWS, but the plan remains provider‑agnostic where possible</w:t>
+              <w:t>Target cloud provider not yet selected; plan remains provider‑agnostic and outlines options for major providers (AWS, Azure, GCP)</w:t>
             </w:r>
           </w:p>
         </w:tc>
@@ -1565,7 +1880,7 @@
           <w:p>
             <w:r/>
             <w:r>
-              <w:t>Allocated budget is roughly $50,000, reflecting a “tight” constraint</w:t>
+              <w:t>Budget is limited but sufficient to cover licensing, migration tools, and minimal consulting; assume $75,000‑$100,000 available</w:t>
             </w:r>
           </w:p>
         </w:tc>
@@ -1589,7 +1904,7 @@
           <w:p>
             <w:r/>
             <w:r>
-              <w:t>CRM data volume is about 200 GB, encompassing databases and attachments</w:t>
+              <w:t>Data volume is moderate (under 5 TB) and can be transferred using standard bandwidth and incremental sync techniques</w:t>
             </w:r>
           </w:p>
         </w:tc>
@@ -1615,7 +1930,7 @@
           <w:p>
             <w:r/>
             <w:r>
-              <w:t>Existing infrastructure includes standard on‑premise servers and network connectivity sufficient for migration</w:t>
+              <w:t>No extraordinary compliance constraints beyond typical data protection; assume standard GDPR‑compliant controls are required</w:t>
             </w:r>
           </w:p>
         </w:tc>
@@ -1639,7 +1954,7 @@
           <w:p>
             <w:r/>
             <w:r>
-              <w:t>Compliance requirements are limited to GDPR‑style data protection, no industry‑specific mandates</w:t>
+              <w:t>Internal team includes at least one senior DBA, one network engineer, and a project manager; external expertise can be engaged as needed</w:t>
             </w:r>
           </w:p>
         </w:tc>
@@ -1665,7 +1980,7 @@
           <w:p>
             <w:r/>
             <w:r>
-              <w:t>Internal team consists of three senior engineers plus a part‑time project manager, with additional external support to be sourced if needed</w:t>
+              <w:t>Existing integrations will be catalogued and re‑implemented post‑migration; assume they can be handled within the project scope</w:t>
             </w:r>
           </w:p>
         </w:tc>
@@ -1682,15 +1997,7 @@
         <w:pStyle w:val="ListBullet"/>
       </w:pPr>
       <w:r>
-        <w:t>Tight budget may limit ability to purchase premium migration tools or extra staffing</w:t>
-      </w:r>
-    </w:p>
-    <w:p>
-      <w:pPr>
-        <w:pStyle w:val="ListBullet"/>
-      </w:pPr>
-      <w:r>
-        <w:t>Zero‑downtime requirement adds complexity and may increase effort within the 6‑week timeline</w:t>
+        <w:t>Tight budget versus aggressive 6‑week timeline with zero‑downtime requirement</w:t>
       </w:r>
     </w:p>
     <w:p>
@@ -1711,7 +2018,7 @@
         <w:pStyle w:val="ListNumber"/>
       </w:pPr>
       <w:r>
-        <w:t>Please confirm: Current CRM platform and version</w:t>
+        <w:t>Please confirm: Current on‑premises CRM platform and version</w:t>
       </w:r>
     </w:p>
     <w:p>
@@ -1719,7 +2026,7 @@
         <w:pStyle w:val="ListNumber"/>
       </w:pPr>
       <w:r>
-        <w:t>Please confirm: Target cloud provider (AWS, Azure, GCP, etc.)</w:t>
+        <w:t>Please confirm: Target cloud provider or preferred cloud environment</w:t>
       </w:r>
     </w:p>
     <w:p>
@@ -1727,7 +2034,7 @@
         <w:pStyle w:val="ListNumber"/>
       </w:pPr>
       <w:r>
-        <w:t>Please confirm: Allocated budget amount</w:t>
+        <w:t>Please confirm: Specific budget amount allocated for the migration</w:t>
       </w:r>
     </w:p>
     <w:p>
@@ -1735,15 +2042,7 @@
         <w:pStyle w:val="ListNumber"/>
       </w:pPr>
       <w:r>
-        <w:t>Please confirm: Size of CRM data and databases</w:t>
-      </w:r>
-    </w:p>
-    <w:p>
-      <w:pPr>
-        <w:pStyle w:val="ListNumber"/>
-      </w:pPr>
-      <w:r>
-        <w:t>Please confirm: Existing on‑premise infrastructure details</w:t>
+        <w:t>Please confirm: Total data volume and any large attachments/files</w:t>
       </w:r>
     </w:p>
     <w:p>
@@ -1759,105 +2058,15 @@
         <w:pStyle w:val="ListNumber"/>
       </w:pPr>
       <w:r>
-        <w:t>Please confirm: Available internal resources and skill sets</w:t>
+        <w:t>Please confirm: Available internal resources and skill sets (e.g., DBAs, network engineers)</w:t>
       </w:r>
     </w:p>
     <w:p>
       <w:pPr>
-        <w:pStyle w:val="Heading1"/>
+        <w:pStyle w:val="ListNumber"/>
       </w:pPr>
       <w:r>
-        <w:t>Deliverables &amp; Acceptance Criteria</w:t>
-      </w:r>
-    </w:p>
-    <w:p>
-      <w:r>
-        <w:t>The migration effort will produce a defined set of artifacts that enable the CTO and leadership to verify successful completion and ongoing stability of the CRM in the cloud.</w:t>
-      </w:r>
-    </w:p>
-    <w:p>
-      <w:pPr>
-        <w:pStyle w:val="ListBullet"/>
-      </w:pPr>
-      <w:r>
-        <w:t>Architecture Diagram – detailed blue‑green target design hosted on AWS, authored by the Solution Architect</w:t>
-      </w:r>
-    </w:p>
-    <w:p>
-      <w:pPr>
-        <w:pStyle w:val="ListBullet"/>
-      </w:pPr>
-      <w:r>
-        <w:t>Migration Scripts – automated IaC and data replication scripts version‑controlled, created by the Cloud Engineer and DevOps Engineer</w:t>
-      </w:r>
-    </w:p>
-    <w:p>
-      <w:pPr>
-        <w:pStyle w:val="ListBullet"/>
-      </w:pPr>
-      <w:r>
-        <w:t>Test Results – functional, performance, and zero‑downtime cutover test reports generated by the QA Engineer</w:t>
-      </w:r>
-    </w:p>
-    <w:p>
-      <w:pPr>
-        <w:pStyle w:val="ListBullet"/>
-      </w:pPr>
-      <w:r>
-        <w:t>Cutover Checklist – step‑by‑step blue‑green switch procedure with rollback actions, maintained by the Project Manager and Support Engineer</w:t>
-      </w:r>
-    </w:p>
-    <w:p>
-      <w:pPr>
-        <w:pStyle w:val="ListBullet"/>
-      </w:pPr>
-      <w:r>
-        <w:t>User Communication Pack – migration notice and post‑cutover support guide prepared by the Trainer</w:t>
-      </w:r>
-    </w:p>
-    <w:p>
-      <w:r>
-        <w:t>Acceptance will be measured against the following criteria, all of which must be satisfied before sign‑off:</w:t>
-      </w:r>
-    </w:p>
-    <w:p>
-      <w:pPr>
-        <w:pStyle w:val="ListBullet"/>
-      </w:pPr>
-      <w:r>
-        <w:t>Zero‑downtime cutover achieved with no service interruption exceeding 5 minutes during the live switch (validated by real‑time monitoring logs)</w:t>
-      </w:r>
-    </w:p>
-    <w:p>
-      <w:pPr>
-        <w:pStyle w:val="ListBullet"/>
-      </w:pPr>
-      <w:r>
-        <w:t>Data integrity confirmed – row‑level checksum comparison shows 100 % match between source and target databases, and all attachment files are verified accessible</w:t>
-      </w:r>
-    </w:p>
-    <w:p>
-      <w:pPr>
-        <w:pStyle w:val="ListBullet"/>
-      </w:pPr>
-      <w:r>
-        <w:t>Performance baseline met – post‑migration response times and throughput are within 10 % of the pre‑migration on‑premise benchmarks, as documented in the performance test report</w:t>
-      </w:r>
-    </w:p>
-    <w:p>
-      <w:pPr>
-        <w:pStyle w:val="ListBullet"/>
-      </w:pPr>
-      <w:r>
-        <w:t>All migration scripts execute without errors in the production environment and are stored in the approved repository with proper version tags</w:t>
-      </w:r>
-    </w:p>
-    <w:p>
-      <w:pPr>
-        <w:pStyle w:val="ListBullet"/>
-      </w:pPr>
-      <w:r>
-        <w:t>Stakeholder sign‑off obtained from the Project Manager, Solution Architect, and CTO after successful hyper‑care period (48 hours)</w:t>
+        <w:t>Please confirm: Existing integration points with other systems</w:t>
       </w:r>
     </w:p>
     <w:sectPr>

</xml_diff>